<commit_message>
docs: refresh user manual artifacts
Signed-off-by: Scott Converse <1474146+scottconverse@users.noreply.github.com>
</commit_message>
<xml_diff>
--- a/docs/USER-MANUAL.docx
+++ b/docs/USER-MANUAL.docx
@@ -3965,75 +3965,43 @@
         <w:pStyle w:val="FirstParagraph"/>
       </w:pPr>
       <w:r>
-        <w:t xml:space="preserve">When live captions are on, CivicCast writes captions as the meeting happens —</w:t>
-      </w:r>
-      <w:r>
-        <w:t xml:space="preserve"> </w:t>
-      </w:r>
-      <w:r>
-        <w:t xml:space="preserve">but it captions</w:t>
-      </w:r>
-      <w:r>
-        <w:t xml:space="preserve"> </w:t>
-      </w:r>
-      <w:r>
-        <w:rPr>
-          <w:b/>
-          <w:bCs/>
-        </w:rPr>
-        <w:t xml:space="preserve">one channel at a time</w:t>
-      </w:r>
-      <w:r>
-        <w:t xml:space="preserve">. On a station with more than one</w:t>
-      </w:r>
-      <w:r>
-        <w:t xml:space="preserve"> </w:t>
-      </w:r>
-      <w:r>
-        <w:t xml:space="preserve">channel on air, the others are</w:t>
-      </w:r>
-      <w:r>
-        <w:t xml:space="preserve"> </w:t>
-      </w:r>
-      <w:r>
-        <w:rPr>
-          <w:b/>
-          <w:bCs/>
-        </w:rPr>
-        <w:t xml:space="preserve">paused, most of the time</w:t>
-      </w:r>
-      <w:r>
-        <w:t xml:space="preserve">, with no live</w:t>
-      </w:r>
-      <w:r>
-        <w:t xml:space="preserve"> </w:t>
-      </w:r>
-      <w:r>
-        <w:t xml:space="preserve">captions showing and their audio discarded rather than saved up for later —</w:t>
-      </w:r>
-      <w:r>
-        <w:t xml:space="preserve"> </w:t>
-      </w:r>
-      <w:r>
-        <w:t xml:space="preserve">this is not a brief wait, it is the normal state for every channel that</w:t>
-      </w:r>
-      <w:r>
-        <w:t xml:space="preserve"> </w:t>
-      </w:r>
-      <w:r>
-        <w:t xml:space="preserve">isn’t the one currently being captioned. It is useful, and it is hard work</w:t>
-      </w:r>
-      <w:r>
-        <w:t xml:space="preserve"> </w:t>
-      </w:r>
-      <w:r>
-        <w:t xml:space="preserve">for the computer — hard enough that on a station without a suitable graphics</w:t>
-      </w:r>
-      <w:r>
-        <w:t xml:space="preserve"> </w:t>
-      </w:r>
-      <w:r>
-        <w:t xml:space="preserve">card it can compete with the broadcast itself for the processor.</w:t>
+        <w:t xml:space="preserve">When live captions are on, CivicCast writes captions as the meeting happens.</w:t>
+      </w:r>
+      <w:r>
+        <w:t xml:space="preserve"> </w:t>
+      </w:r>
+      <w:r>
+        <w:t xml:space="preserve">On a supported CUDA graphics card it can transcribe up to three channels at</w:t>
+      </w:r>
+      <w:r>
+        <w:t xml:space="preserve"> </w:t>
+      </w:r>
+      <w:r>
+        <w:t xml:space="preserve">the same time. On CPU-only stations it captions one channel at a time to keep</w:t>
+      </w:r>
+      <w:r>
+        <w:t xml:space="preserve"> </w:t>
+      </w:r>
+      <w:r>
+        <w:t xml:space="preserve">playout responsive; additional channels may fall behind, pause captions, and</w:t>
+      </w:r>
+      <w:r>
+        <w:t xml:space="preserve"> </w:t>
+      </w:r>
+      <w:r>
+        <w:t xml:space="preserve">discard stale audio rather than competing indefinitely with the broadcast.</w:t>
+      </w:r>
+      <w:r>
+        <w:t xml:space="preserve"> </w:t>
+      </w:r>
+      <w:r>
+        <w:t xml:space="preserve">Live captioning is hard work for the computer, especially without a suitable</w:t>
+      </w:r>
+      <w:r>
+        <w:t xml:space="preserve"> </w:t>
+      </w:r>
+      <w:r>
+        <w:t xml:space="preserve">graphics card.</w:t>
       </w:r>
     </w:p>
     <w:p>
@@ -10519,7 +10487,7 @@
         <w:t xml:space="preserve"> </w:t>
       </w:r>
       <w:r>
-        <w:t xml:space="preserve">calls may be in flight at the same time. Default:</w:t>
+        <w:t xml:space="preserve">calls may be in flight at the same time. Hardware-selected default:</w:t>
       </w:r>
       <w:r>
         <w:t xml:space="preserve"> </w:t>
@@ -10531,25 +10499,49 @@
         <w:t xml:space="preserve">1</w:t>
       </w:r>
       <w:r>
-        <w:t xml:space="preserve">, station-wide,</w:t>
-      </w:r>
-      <w:r>
-        <w:t xml:space="preserve"> </w:t>
-      </w:r>
-      <w:r>
-        <w:t xml:space="preserve">regardless of core count (item 79, 2026-09, tightened from a per-core-count</w:t>
-      </w:r>
-      <w:r>
-        <w:t xml:space="preserve"> </w:t>
-      </w:r>
-      <w:r>
-        <w:t xml:space="preserve">formula, max 3). A station with more channels ON_AIR than this bound will</w:t>
-      </w:r>
-      <w:r>
-        <w:t xml:space="preserve"> </w:t>
-      </w:r>
-      <w:r>
-        <w:t xml:space="preserve">have live captions paused on the others most of the time — see</w:t>
+        <w:t xml:space="preserve"> </w:t>
+      </w:r>
+      <w:r>
+        <w:t xml:space="preserve">on</w:t>
+      </w:r>
+      <w:r>
+        <w:t xml:space="preserve"> </w:t>
+      </w:r>
+      <w:r>
+        <w:t xml:space="preserve">CPU and up to</w:t>
+      </w:r>
+      <w:r>
+        <w:t xml:space="preserve"> </w:t>
+      </w:r>
+      <w:r>
+        <w:rPr>
+          <w:rStyle w:val="VerbatimChar"/>
+        </w:rPr>
+        <w:t xml:space="preserve">3</w:t>
+      </w:r>
+      <w:r>
+        <w:t xml:space="preserve"> </w:t>
+      </w:r>
+      <w:r>
+        <w:t xml:space="preserve">on CUDA, capped by the caption runtime’s worker capacity.</w:t>
+      </w:r>
+      <w:r>
+        <w:t xml:space="preserve"> </w:t>
+      </w:r>
+      <w:r>
+        <w:t xml:space="preserve">The CPU default preserves playout priority; the CUDA default lets a</w:t>
+      </w:r>
+      <w:r>
+        <w:t xml:space="preserve"> </w:t>
+      </w:r>
+      <w:r>
+        <w:t xml:space="preserve">three-channel station process each five-second segment cycle concurrently.</w:t>
+      </w:r>
+      <w:r>
+        <w:t xml:space="preserve"> </w:t>
+      </w:r>
+      <w:r>
+        <w:t xml:space="preserve">An explicit value overrides this selection; see</w:t>
       </w:r>
       <w:r>
         <w:t xml:space="preserve"> </w:t>

</xml_diff>

<commit_message>
chore(release): prepare beta.8 candidate identity
Signed-off-by: Scott Converse <1474146+scottconverse@users.noreply.github.com>
</commit_message>
<xml_diff>
--- a/docs/USER-MANUAL.docx
+++ b/docs/USER-MANUAL.docx
@@ -15,7 +15,7 @@
         <w:pStyle w:val="Subtitle"/>
       </w:pPr>
       <w:r>
-        <w:t xml:space="preserve">For station operators, clerks, and IT staff - v1.0.0-beta.7 (native Windows line)</w:t>
+        <w:t xml:space="preserve">For station operators, clerks, and IT staff - v1.0.0-beta.8 (native Windows line)</w:t>
       </w:r>
     </w:p>
     <w:p>
@@ -330,7 +330,7 @@
         <w:rPr>
           <w:rStyle w:val="VerbatimChar"/>
         </w:rPr>
-        <w:t xml:space="preserve">v1.0.0-beta.7</w:t>
+        <w:t xml:space="preserve">v1.0.0-beta.8</w:t>
       </w:r>
       <w:r>
         <w:t xml:space="preserve"> </w:t>

</xml_diff>

<commit_message>
fix(captions): serialize session transitions and prepare beta8 release docs
Signed-off-by: Scott Converse <1474146+scottconverse@users.noreply.github.com>
</commit_message>
<xml_diff>
--- a/docs/USER-MANUAL.docx
+++ b/docs/USER-MANUAL.docx
@@ -31,7 +31,7 @@
         <w:pStyle w:val="Date"/>
       </w:pPr>
       <w:r>
-        <w:t xml:space="preserve">2026-09-08</w:t>
+        <w:t xml:space="preserve">2026-09-17</w:t>
       </w:r>
     </w:p>
     <w:sdt>
@@ -4064,19 +4064,19 @@
         <w:t xml:space="preserve"> </w:t>
       </w:r>
       <w:r>
-        <w:t xml:space="preserve">when the station is installed in this beta (see the known</w:t>
-      </w:r>
-      <w:r>
-        <w:t xml:space="preserve"> </w:t>
-      </w:r>
-      <w:r>
-        <w:t xml:space="preserve">issue below); turn it on there if your station can keep up. Only a setup</w:t>
-      </w:r>
-      <w:r>
-        <w:t xml:space="preserve"> </w:t>
-      </w:r>
-      <w:r>
-        <w:t xml:space="preserve">admin can change it. Turning it</w:t>
+        <w:t xml:space="preserve">on a new installation of this beta; an explicitly saved setting</w:t>
+      </w:r>
+      <w:r>
+        <w:t xml:space="preserve"> </w:t>
+      </w:r>
+      <w:r>
+        <w:t xml:space="preserve">survives an upgrade. Turn it on only after checking your station can keep up.</w:t>
+      </w:r>
+      <w:r>
+        <w:t xml:space="preserve"> </w:t>
+      </w:r>
+      <w:r>
+        <w:t xml:space="preserve">Only a setup admin can change it. Turning it</w:t>
       </w:r>
       <w:r>
         <w:t xml:space="preserve"> </w:t>
@@ -4092,37 +4092,19 @@
         <w:t xml:space="preserve"> </w:t>
       </w:r>
       <w:r>
-        <w:t xml:space="preserve">stops captions within a few seconds,</w:t>
-      </w:r>
-      <w:r>
-        <w:t xml:space="preserve"> </w:t>
-      </w:r>
-      <w:r>
-        <w:t xml:space="preserve">but the part of the broadcast path that writes captions into the video is</w:t>
-      </w:r>
-      <w:r>
-        <w:t xml:space="preserve"> </w:t>
-      </w:r>
-      <w:r>
-        <w:t xml:space="preserve">only removed the next time each channel goes on air (or the next time the</w:t>
-      </w:r>
-      <w:r>
-        <w:t xml:space="preserve"> </w:t>
-      </w:r>
-      <w:r>
-        <w:t xml:space="preserve">station restarts) — so if you are turning it off because of the freeze</w:t>
-      </w:r>
-      <w:r>
-        <w:t xml:space="preserve"> </w:t>
-      </w:r>
-      <w:r>
-        <w:t xml:space="preserve">described below, expect the freeze to stop after that, not immediately.</w:t>
-      </w:r>
-      <w:r>
-        <w:t xml:space="preserve"> </w:t>
-      </w:r>
-      <w:r>
-        <w:t xml:space="preserve">Turning it</w:t>
+        <w:t xml:space="preserve">stops caption transcription</w:t>
+      </w:r>
+      <w:r>
+        <w:t xml:space="preserve"> </w:t>
+      </w:r>
+      <w:r>
+        <w:t xml:space="preserve">within a few seconds, but the broadcast component that embeds captions in</w:t>
+      </w:r>
+      <w:r>
+        <w:t xml:space="preserve"> </w:t>
+      </w:r>
+      <w:r>
+        <w:t xml:space="preserve">the video is removed only at each channel’s next start. Turning it</w:t>
       </w:r>
       <w:r>
         <w:t xml:space="preserve"> </w:t>
@@ -4138,41 +4120,25 @@
         <w:t xml:space="preserve"> </w:t>
       </w:r>
       <w:r>
-        <w:t xml:space="preserve">likewise takes effect at each channel’s next start. You do</w:t>
-      </w:r>
-      <w:r>
-        <w:t xml:space="preserve"> </w:t>
-      </w:r>
-      <w:r>
-        <w:t xml:space="preserve">not need to restart anything and you can do it during a live meeting. Until</w:t>
-      </w:r>
-      <w:r>
-        <w:t xml:space="preserve"> </w:t>
-      </w:r>
-      <w:r>
-        <w:t xml:space="preserve">each channel next goes on air, those channels show red on</w:t>
-      </w:r>
-      <w:r>
-        <w:t xml:space="preserve"> </w:t>
-      </w:r>
-      <w:r>
-        <w:rPr>
-          <w:i/>
-          <w:iCs/>
-        </w:rPr>
-        <w:t xml:space="preserve">On air right now</w:t>
-      </w:r>
-      <w:r>
-        <w:t xml:space="preserve"> </w:t>
-      </w:r>
-      <w:r>
-        <w:t xml:space="preserve">because the station is looking for captions it cannot see yet. Restart each</w:t>
-      </w:r>
-      <w:r>
-        <w:t xml:space="preserve"> </w:t>
-      </w:r>
-      <w:r>
-        <w:t xml:space="preserve">channel to clear it.</w:t>
+        <w:t xml:space="preserve">likewise requires each channel’s next start to build that component. Saving</w:t>
+      </w:r>
+      <w:r>
+        <w:t xml:space="preserve"> </w:t>
+      </w:r>
+      <w:r>
+        <w:t xml:space="preserve">the switch does not restart an on-air channel automatically. Schedule the</w:t>
+      </w:r>
+      <w:r>
+        <w:t xml:space="preserve"> </w:t>
+      </w:r>
+      <w:r>
+        <w:t xml:space="preserve">channel stop/start at a suitable time: it interrupts output. Until then, the</w:t>
+      </w:r>
+      <w:r>
+        <w:t xml:space="preserve"> </w:t>
+      </w:r>
+      <w:r>
+        <w:t xml:space="preserve">caption check can show red because captions are expected but not yet present.</w:t>
       </w:r>
     </w:p>
     <w:p>
@@ -4184,43 +4150,55 @@
           <w:b/>
           <w:bCs/>
         </w:rPr>
-        <w:t xml:space="preserve">Known issue in this beta (why it starts off):</w:t>
-      </w:r>
-      <w:r>
-        <w:t xml:space="preserve"> </w:t>
-      </w:r>
-      <w:r>
-        <w:t xml:space="preserve">with live captions on,</w:t>
-      </w:r>
-      <w:r>
-        <w:t xml:space="preserve"> </w:t>
-      </w:r>
-      <w:r>
-        <w:t xml:space="preserve">the picture can freeze for 25–30 seconds and then catch up in a burst every</w:t>
-      </w:r>
-      <w:r>
-        <w:t xml:space="preserve"> </w:t>
-      </w:r>
-      <w:r>
-        <w:t xml:space="preserve">minute or two; rarely, the station’s 10-second stall watchdog restarts the</w:t>
-      </w:r>
-      <w:r>
-        <w:t xml:space="preserve"> </w:t>
-      </w:r>
-      <w:r>
-        <w:t xml:space="preserve">channel (about a 30-second gap on air). The cause is under investigation</w:t>
-      </w:r>
-      <w:r>
-        <w:t xml:space="preserve"> </w:t>
-      </w:r>
-      <w:r>
-        <w:t xml:space="preserve">and is somewhere in the live-caption path; the fix is planned for the next</w:t>
-      </w:r>
-      <w:r>
-        <w:t xml:space="preserve"> </w:t>
-      </w:r>
-      <w:r>
-        <w:t xml:space="preserve">update.</w:t>
+        <w:t xml:space="preserve">What changed in beta.8:</w:t>
+      </w:r>
+      <w:r>
+        <w:t xml:space="preserve"> </w:t>
+      </w:r>
+      <w:r>
+        <w:t xml:space="preserve">earlier testing saw repeated picture freezes with</w:t>
+      </w:r>
+      <w:r>
+        <w:t xml:space="preserve"> </w:t>
+      </w:r>
+      <w:r>
+        <w:t xml:space="preserve">live captions on. Beta.8 includes repairs to caption processing, restart</w:t>
+      </w:r>
+      <w:r>
+        <w:t xml:space="preserve"> </w:t>
+      </w:r>
+      <w:r>
+        <w:t xml:space="preserve">timing and background cleanup. A short Blackwell test matched captions after</w:t>
+      </w:r>
+      <w:r>
+        <w:t xml:space="preserve"> </w:t>
+      </w:r>
+      <w:r>
+        <w:t xml:space="preserve">a controlled restart to text decoded from the outgoing video stream. A</w:t>
+      </w:r>
+      <w:r>
+        <w:t xml:space="preserve"> </w:t>
+      </w:r>
+      <w:r>
+        <w:t xml:space="preserve">separate test verified that the speech-recognition model loaded on the GPU.</w:t>
+      </w:r>
+      <w:r>
+        <w:t xml:space="preserve"> </w:t>
+      </w:r>
+      <w:r>
+        <w:t xml:space="preserve">These are bounded checks, not proof of uninterrupted all-day operation or</w:t>
+      </w:r>
+      <w:r>
+        <w:t xml:space="preserve"> </w:t>
+      </w:r>
+      <w:r>
+        <w:t xml:space="preserve">proof that every caption is correct. Startup overload remains a risk to watch;</w:t>
+      </w:r>
+      <w:r>
+        <w:t xml:space="preserve"> </w:t>
+      </w:r>
+      <w:r>
+        <w:t xml:space="preserve">the overload limit and two-minute initial pause have not been relaxed.</w:t>
       </w:r>
     </w:p>
     <w:p>
@@ -4342,13 +4320,25 @@
         <w:t xml:space="preserve"> </w:t>
       </w:r>
       <w:r>
-        <w:t xml:space="preserve">channel mean that station cannot caption that channel live — turn the switch</w:t>
-      </w:r>
-      <w:r>
-        <w:t xml:space="preserve"> </w:t>
-      </w:r>
-      <w:r>
-        <w:t xml:space="preserve">off, or ask about a lower-quality caption model or a supported graphics card.</w:t>
+        <w:t xml:space="preserve">channel mean the live caption path is not keeping up under its current</w:t>
+      </w:r>
+      <w:r>
+        <w:t xml:space="preserve"> </w:t>
+      </w:r>
+      <w:r>
+        <w:t xml:space="preserve">conditions. Turn the switch off if necessary to protect the broadcast, retain</w:t>
+      </w:r>
+      <w:r>
+        <w:t xml:space="preserve"> </w:t>
+      </w:r>
+      <w:r>
+        <w:t xml:space="preserve">the logs, and have your technical admin investigate load, storage cleanup and</w:t>
+      </w:r>
+      <w:r>
+        <w:t xml:space="preserve"> </w:t>
+      </w:r>
+      <w:r>
+        <w:t xml:space="preserve">the loaded caption model before assuming the graphics card is inadequate.</w:t>
       </w:r>
     </w:p>
     <w:bookmarkEnd w:id="30"/>

</xml_diff>

<commit_message>
fix(captions): confirm timed words and close release review gaps
Signed-off-by: Scott Converse <1474146+scottconverse@users.noreply.github.com>
</commit_message>
<xml_diff>
--- a/docs/USER-MANUAL.docx
+++ b/docs/USER-MANUAL.docx
@@ -4009,6 +4009,53 @@
         <w:pStyle w:val="BodyText"/>
       </w:pPr>
       <w:r>
+        <w:t xml:space="preserve">The live recognizer checks speech across overlapping audio windows before</w:t>
+      </w:r>
+      <w:r>
+        <w:t xml:space="preserve"> </w:t>
+      </w:r>
+      <w:r>
+        <w:t xml:space="preserve">putting confirmed words on air. A</w:t>
+      </w:r>
+      <w:r>
+        <w:t xml:space="preserve"> </w:t>
+      </w:r>
+      <w:r>
+        <w:rPr>
+          <w:rStyle w:val="VerbatimChar"/>
+        </w:rPr>
+        <w:t xml:space="preserve">...</w:t>
+      </w:r>
+      <w:r>
+        <w:t xml:space="preserve"> </w:t>
+      </w:r>
+      <w:r>
+        <w:t xml:space="preserve">inside a caption marks words it could</w:t>
+      </w:r>
+      <w:r>
+        <w:t xml:space="preserve"> </w:t>
+      </w:r>
+      <w:r>
+        <w:t xml:space="preserve">not confirm; it is not a transcription of a spoken pause. Unconfirmed words</w:t>
+      </w:r>
+      <w:r>
+        <w:t xml:space="preserve"> </w:t>
+      </w:r>
+      <w:r>
+        <w:t xml:space="preserve">can appear in the review queue without having appeared on air. Stopping a</w:t>
+      </w:r>
+      <w:r>
+        <w:t xml:space="preserve"> </w:t>
+      </w:r>
+      <w:r>
+        <w:t xml:space="preserve">channel does not promote those unconfirmed live words into the broadcast.</w:t>
+      </w:r>
+    </w:p>
+    <w:p>
+      <w:pPr>
+        <w:pStyle w:val="BodyText"/>
+      </w:pPr>
+      <w:r>
         <w:rPr>
           <w:b/>
           <w:bCs/>
@@ -4199,6 +4246,57 @@
       </w:r>
       <w:r>
         <w:t xml:space="preserve">the overload limit and two-minute initial pause have not been relaxed.</w:t>
+      </w:r>
+    </w:p>
+    <w:p>
+      <w:pPr>
+        <w:pStyle w:val="BodyText"/>
+      </w:pPr>
+      <w:r>
+        <w:t xml:space="preserve">If a channel reports</w:t>
+      </w:r>
+      <w:r>
+        <w:t xml:space="preserve"> </w:t>
+      </w:r>
+      <w:r>
+        <w:rPr>
+          <w:b/>
+          <w:bCs/>
+        </w:rPr>
+        <w:t xml:space="preserve">captions disabled: session reset failed</w:t>
+      </w:r>
+      <w:r>
+        <w:t xml:space="preserve">, its picture</w:t>
+      </w:r>
+      <w:r>
+        <w:t xml:space="preserve"> </w:t>
+      </w:r>
+      <w:r>
+        <w:t xml:space="preserve">and sound can continue, but captions stay off for that session to avoid showing</w:t>
+      </w:r>
+      <w:r>
+        <w:t xml:space="preserve"> </w:t>
+      </w:r>
+      <w:r>
+        <w:t xml:space="preserve">old text. Resolve the reported storage problem, then stop and start the channel</w:t>
+      </w:r>
+      <w:r>
+        <w:t xml:space="preserve"> </w:t>
+      </w:r>
+      <w:r>
+        <w:t xml:space="preserve">at a suitable time. Reloading the program alone does not restore captions.</w:t>
+      </w:r>
+      <w:r>
+        <w:t xml:space="preserve"> </w:t>
+      </w:r>
+      <w:r>
+        <w:t xml:space="preserve">During a background storage check, caption review text may be available without</w:t>
+      </w:r>
+      <w:r>
+        <w:t xml:space="preserve"> </w:t>
+      </w:r>
+      <w:r>
+        <w:t xml:space="preserve">its audio clip; the review screen will say the audio is unavailable.</w:t>
       </w:r>
     </w:p>
     <w:p>

</xml_diff>

<commit_message>
docs(manual): update user manual for the beta.10 candidate and re-render
Manual text, PDF, DOCX and the in-product manual.json regenerated with the
repo renderers (pandoc + xelatex); freshness checks pass.

Co-Authored-By: Claude Sonnet 5.5 <noreply@anthropic.com>
</commit_message>
<xml_diff>
--- a/docs/USER-MANUAL.docx
+++ b/docs/USER-MANUAL.docx
@@ -15,7 +15,7 @@
         <w:pStyle w:val="Subtitle"/>
       </w:pPr>
       <w:r>
-        <w:t xml:space="preserve">For station operators, clerks, and IT staff - v1.0.0-beta.8 (native Windows line)</w:t>
+        <w:t xml:space="preserve">For station operators, clerks, and IT staff - v1.0.0-beta.10 (native Windows line)</w:t>
       </w:r>
     </w:p>
     <w:p>
@@ -31,7 +31,7 @@
         <w:pStyle w:val="Date"/>
       </w:pPr>
       <w:r>
-        <w:t xml:space="preserve">2026-09-17</w:t>
+        <w:t xml:space="preserve">2026-10-02</w:t>
       </w:r>
     </w:p>
     <w:sdt>
@@ -330,7 +330,7 @@
         <w:rPr>
           <w:rStyle w:val="VerbatimChar"/>
         </w:rPr>
-        <w:t xml:space="preserve">v1.0.0-beta.8</w:t>
+        <w:t xml:space="preserve">v1.0.0-beta.10</w:t>
       </w:r>
       <w:r>
         <w:t xml:space="preserve"> </w:t>
@@ -342,7 +342,25 @@
         <w:t xml:space="preserve"> </w:t>
       </w:r>
       <w:r>
-        <w:t xml:space="preserve">software. A bundled manual does not itself establish publication or installation acceptance.</w:t>
+        <w:t xml:space="preserve">software, which is a beta candidate: it has not been published, and its formal</w:t>
+      </w:r>
+      <w:r>
+        <w:t xml:space="preserve"> </w:t>
+      </w:r>
+      <w:r>
+        <w:t xml:space="preserve">station acceptance (Gate A) has not been run. The latest published release is</w:t>
+      </w:r>
+      <w:r>
+        <w:t xml:space="preserve"> </w:t>
+      </w:r>
+      <w:r>
+        <w:rPr>
+          <w:rStyle w:val="VerbatimChar"/>
+        </w:rPr>
+        <w:t xml:space="preserve">v1.0.0-beta.7</w:t>
+      </w:r>
+      <w:r>
+        <w:t xml:space="preserve">. A bundled manual does not itself establish publication or installation acceptance.</w:t>
       </w:r>
       <w:r>
         <w:t xml:space="preserve"> </w:t>
@@ -613,6 +631,364 @@
       </w:r>
       <w:r>
         <w:t xml:space="preserve">number or this manual is not a substitute for that evidence.</w:t>
+      </w:r>
+    </w:p>
+    <w:p>
+      <w:pPr>
+        <w:pStyle w:val="BodyText"/>
+      </w:pPr>
+      <w:r>
+        <w:rPr>
+          <w:b/>
+          <w:bCs/>
+        </w:rPr>
+        <w:t xml:space="preserve">What beta.10 adds.</w:t>
+      </w:r>
+      <w:r>
+        <w:t xml:space="preserve"> </w:t>
+      </w:r>
+      <w:r>
+        <w:t xml:space="preserve">The beta.10 candidate (the next release; beta.8 and</w:t>
+      </w:r>
+      <w:r>
+        <w:t xml:space="preserve"> </w:t>
+      </w:r>
+      <w:r>
+        <w:t xml:space="preserve">beta.9 were never published) makes program changes without a black or silent</w:t>
+      </w:r>
+      <w:r>
+        <w:t xml:space="preserve"> </w:t>
+      </w:r>
+      <w:r>
+        <w:t xml:space="preserve">gap and adds a watchdog that ends a program change that gets stuck. It levels</w:t>
+      </w:r>
+      <w:r>
+        <w:t xml:space="preserve"> </w:t>
+      </w:r>
+      <w:r>
+        <w:t xml:space="preserve">speech toward -16 LUFS (a standard loudness measure) when a program is</w:t>
+      </w:r>
+      <w:r>
+        <w:t xml:space="preserve"> </w:t>
+      </w:r>
+      <w:r>
+        <w:t xml:space="preserve">prepared for air, repeats schedules that are set to loop, and keeps up to</w:t>
+      </w:r>
+      <w:r>
+        <w:t xml:space="preserve"> </w:t>
+      </w:r>
+      <w:r>
+        <w:t xml:space="preserve">60 GB of prepared copies of long programs by default (the</w:t>
+      </w:r>
+      <w:r>
+        <w:t xml:space="preserve"> </w:t>
+      </w:r>
+      <w:r>
+        <w:t xml:space="preserve">“conform cache”</w:t>
+      </w:r>
+      <w:r>
+        <w:t xml:space="preserve">;</w:t>
+      </w:r>
+      <w:r>
+        <w:t xml:space="preserve"> </w:t>
+      </w:r>
+      <w:r>
+        <w:t xml:space="preserve">set</w:t>
+      </w:r>
+      <w:r>
+        <w:t xml:space="preserve"> </w:t>
+      </w:r>
+      <w:r>
+        <w:rPr>
+          <w:rStyle w:val="VerbatimChar"/>
+        </w:rPr>
+        <w:t xml:space="preserve">CIVICCAST_CONFORM_CACHE_GB</w:t>
+      </w:r>
+      <w:r>
+        <w:t xml:space="preserve"> </w:t>
+      </w:r>
+      <w:r>
+        <w:t xml:space="preserve">to change it, or</w:t>
+      </w:r>
+      <w:r>
+        <w:t xml:space="preserve"> </w:t>
+      </w:r>
+      <w:r>
+        <w:rPr>
+          <w:rStyle w:val="VerbatimChar"/>
+        </w:rPr>
+        <w:t xml:space="preserve">0</w:t>
+      </w:r>
+      <w:r>
+        <w:t xml:space="preserve"> </w:t>
+      </w:r>
+      <w:r>
+        <w:t xml:space="preserve">to turn it off). It</w:t>
+      </w:r>
+      <w:r>
+        <w:t xml:space="preserve"> </w:t>
+      </w:r>
+      <w:r>
+        <w:t xml:space="preserve">recovers by itself in more fault situations, such as a stuck relay or a worker</w:t>
+      </w:r>
+      <w:r>
+        <w:t xml:space="preserve"> </w:t>
+      </w:r>
+      <w:r>
+        <w:t xml:space="preserve">that falls behind.</w:t>
+      </w:r>
+    </w:p>
+    <w:p>
+      <w:pPr>
+        <w:pStyle w:val="BodyText"/>
+      </w:pPr>
+      <w:r>
+        <w:rPr>
+          <w:b/>
+          <w:bCs/>
+        </w:rPr>
+        <w:t xml:space="preserve">What was measured, and what was not.</w:t>
+      </w:r>
+      <w:r>
+        <w:t xml:space="preserve"> </w:t>
+      </w:r>
+      <w:r>
+        <w:t xml:space="preserve">An eight-hour watched run on a</w:t>
+      </w:r>
+      <w:r>
+        <w:t xml:space="preserve"> </w:t>
+      </w:r>
+      <w:r>
+        <w:t xml:space="preserve">three-channel lab station (education, government and public airing real</w:t>
+      </w:r>
+      <w:r>
+        <w:t xml:space="preserve"> </w:t>
+      </w:r>
+      <w:r>
+        <w:t xml:space="preserve">programs at the same time) used one service process the whole time, with no</w:t>
+      </w:r>
+      <w:r>
+        <w:t xml:space="preserve"> </w:t>
+      </w:r>
+      <w:r>
+        <w:t xml:space="preserve">restart, crash, slate or filler after startup. 40 of 41 verify checks passed</w:t>
+      </w:r>
+      <w:r>
+        <w:t xml:space="preserve"> </w:t>
+      </w:r>
+      <w:r>
+        <w:t xml:space="preserve">(the one raw failure was judged a sampling blip), loudness passed in 16 of 16</w:t>
+      </w:r>
+      <w:r>
+        <w:t xml:space="preserve"> </w:t>
+      </w:r>
+      <w:r>
+        <w:t xml:space="preserve">240-second windows, and 50 program changes were scored with no holes. This is</w:t>
+      </w:r>
+      <w:r>
+        <w:t xml:space="preserve"> </w:t>
+      </w:r>
+      <w:r>
+        <w:t xml:space="preserve">lab evidence only: no human field tester has signed off on beta.10, and runs</w:t>
+      </w:r>
+      <w:r>
+        <w:t xml:space="preserve"> </w:t>
+      </w:r>
+      <w:r>
+        <w:t xml:space="preserve">longer than eight hours, real stations, SDI hardware and cable headends have</w:t>
+      </w:r>
+      <w:r>
+        <w:t xml:space="preserve"> </w:t>
+      </w:r>
+      <w:r>
+        <w:t xml:space="preserve">not been tested for it. See the beta.10 verification record,</w:t>
+      </w:r>
+      <w:r>
+        <w:t xml:space="preserve"> </w:t>
+      </w:r>
+      <w:r>
+        <w:rPr>
+          <w:rStyle w:val="VerbatimChar"/>
+        </w:rPr>
+        <w:t xml:space="preserve">docs/releases/v1.0.0-beta.10-verification.md</w:t>
+      </w:r>
+      <w:r>
+        <w:t xml:space="preserve">.</w:t>
+      </w:r>
+    </w:p>
+    <w:p>
+      <w:pPr>
+        <w:pStyle w:val="BodyText"/>
+      </w:pPr>
+      <w:r>
+        <w:rPr>
+          <w:b/>
+          <w:bCs/>
+        </w:rPr>
+        <w:t xml:space="preserve">Known limits of beta.10.</w:t>
+      </w:r>
+    </w:p>
+    <w:p>
+      <w:pPr>
+        <w:pStyle w:val="Compact"/>
+        <w:numPr>
+          <w:ilvl w:val="0"/>
+          <w:numId w:val="1002"/>
+        </w:numPr>
+      </w:pPr>
+      <w:r>
+        <w:rPr>
+          <w:b/>
+          <w:bCs/>
+        </w:rPr>
+        <w:t xml:space="preserve">Some spoken words can go without captions when the machine is busy.</w:t>
+      </w:r>
+      <w:r>
+        <w:t xml:space="preserve"> </w:t>
+      </w:r>
+      <w:r>
+        <w:t xml:space="preserve">When a channel’s live-caption worker falls behind (most often while the</w:t>
+      </w:r>
+      <w:r>
+        <w:t xml:space="preserve"> </w:t>
+      </w:r>
+      <w:r>
+        <w:t xml:space="preserve">station prepares a long program for the first time), it skips its oldest</w:t>
+      </w:r>
+      <w:r>
+        <w:t xml:space="preserve"> </w:t>
+      </w:r>
+      <w:r>
+        <w:t xml:space="preserve">audio to catch up instead of pausing. In the eight-hour run this happened</w:t>
+      </w:r>
+      <w:r>
+        <w:t xml:space="preserve"> </w:t>
+      </w:r>
+      <w:r>
+        <w:t xml:space="preserve">13 times: about 160 seconds of audio on two channels on a quiet machine.</w:t>
+      </w:r>
+      <w:r>
+        <w:t xml:space="preserve"> </w:t>
+      </w:r>
+      <w:r>
+        <w:t xml:space="preserve">Captions stay on the air, but those seconds have no caption. A fix is the</w:t>
+      </w:r>
+      <w:r>
+        <w:t xml:space="preserve"> </w:t>
+      </w:r>
+      <w:r>
+        <w:t xml:space="preserve">next work item and is not in beta.10. If your station must caption every</w:t>
+      </w:r>
+      <w:r>
+        <w:t xml:space="preserve"> </w:t>
+      </w:r>
+      <w:r>
+        <w:t xml:space="preserve">spoken word, check the captions during live meetings.</w:t>
+      </w:r>
+    </w:p>
+    <w:p>
+      <w:pPr>
+        <w:pStyle w:val="Compact"/>
+        <w:numPr>
+          <w:ilvl w:val="0"/>
+          <w:numId w:val="1002"/>
+        </w:numPr>
+      </w:pPr>
+      <w:r>
+        <w:t xml:space="preserve">Twice in the eight-hour run a program change on one channel did not take on</w:t>
+      </w:r>
+      <w:r>
+        <w:t xml:space="preserve"> </w:t>
+      </w:r>
+      <w:r>
+        <w:t xml:space="preserve">its first try and corrected itself in about three seconds. Viewers saw</w:t>
+      </w:r>
+      <w:r>
+        <w:t xml:space="preserve"> </w:t>
+      </w:r>
+      <w:r>
+        <w:t xml:space="preserve">nothing.</w:t>
+      </w:r>
+    </w:p>
+    <w:p>
+      <w:pPr>
+        <w:pStyle w:val="Compact"/>
+        <w:numPr>
+          <w:ilvl w:val="0"/>
+          <w:numId w:val="1002"/>
+        </w:numPr>
+      </w:pPr>
+      <w:r>
+        <w:t xml:space="preserve">One known single-frame (0.033 second) video drop can happen where two parts</w:t>
+      </w:r>
+      <w:r>
+        <w:t xml:space="preserve"> </w:t>
+      </w:r>
+      <w:r>
+        <w:t xml:space="preserve">of the same program join.</w:t>
+      </w:r>
+    </w:p>
+    <w:p>
+      <w:pPr>
+        <w:pStyle w:val="Compact"/>
+        <w:numPr>
+          <w:ilvl w:val="0"/>
+          <w:numId w:val="1002"/>
+        </w:numPr>
+      </w:pPr>
+      <w:r>
+        <w:t xml:space="preserve">A stretch of a source that is too quiet for the speech leveling to reach the</w:t>
+      </w:r>
+      <w:r>
+        <w:t xml:space="preserve"> </w:t>
+      </w:r>
+      <w:r>
+        <w:t xml:space="preserve">target is reported in the log, not leveled.</w:t>
+      </w:r>
+    </w:p>
+    <w:p>
+      <w:pPr>
+        <w:pStyle w:val="Compact"/>
+        <w:numPr>
+          <w:ilvl w:val="0"/>
+          <w:numId w:val="1002"/>
+        </w:numPr>
+      </w:pPr>
+      <w:r>
+        <w:t xml:space="preserve">Carried over from beta.9 and not re-tested in the beta.10 run: a channel</w:t>
+      </w:r>
+      <w:r>
+        <w:t xml:space="preserve"> </w:t>
+      </w:r>
+      <w:r>
+        <w:t xml:space="preserve">whose schedule runs out and does not repeat can stop and need a manual start;</w:t>
+      </w:r>
+      <w:r>
+        <w:t xml:space="preserve"> </w:t>
+      </w:r>
+      <w:r>
+        <w:rPr>
+          <w:rStyle w:val="VerbatimChar"/>
+        </w:rPr>
+        <w:t xml:space="preserve">/api/health</w:t>
+      </w:r>
+      <w:r>
+        <w:t xml:space="preserve"> </w:t>
+      </w:r>
+      <w:r>
+        <w:t xml:space="preserve">can report healthy while a channel cannot air; and the built-in</w:t>
+      </w:r>
+      <w:r>
+        <w:t xml:space="preserve"> </w:t>
+      </w:r>
+      <w:r>
+        <w:t xml:space="preserve">decode-back check (it decodes the broadcast to confirm the captions) failed</w:t>
+      </w:r>
+      <w:r>
+        <w:t xml:space="preserve"> </w:t>
+      </w:r>
+      <w:r>
+        <w:t xml:space="preserve">on certain cue timings in beta.9.</w:t>
       </w:r>
     </w:p>
     <w:p>
@@ -1000,7 +1376,7 @@
         <w:pStyle w:val="Compact"/>
         <w:numPr>
           <w:ilvl w:val="0"/>
-          <w:numId w:val="1002"/>
+          <w:numId w:val="1003"/>
         </w:numPr>
       </w:pPr>
       <w:r>
@@ -1086,7 +1462,7 @@
         <w:pStyle w:val="Compact"/>
         <w:numPr>
           <w:ilvl w:val="0"/>
-          <w:numId w:val="1002"/>
+          <w:numId w:val="1003"/>
         </w:numPr>
       </w:pPr>
       <w:r>
@@ -1120,7 +1496,7 @@
         <w:pStyle w:val="Compact"/>
         <w:numPr>
           <w:ilvl w:val="0"/>
-          <w:numId w:val="1002"/>
+          <w:numId w:val="1003"/>
         </w:numPr>
       </w:pPr>
       <w:r>
@@ -1154,7 +1530,7 @@
         <w:pStyle w:val="Compact"/>
         <w:numPr>
           <w:ilvl w:val="0"/>
-          <w:numId w:val="1002"/>
+          <w:numId w:val="1003"/>
         </w:numPr>
       </w:pPr>
       <w:r>
@@ -1182,7 +1558,7 @@
         <w:pStyle w:val="Compact"/>
         <w:numPr>
           <w:ilvl w:val="0"/>
-          <w:numId w:val="1002"/>
+          <w:numId w:val="1003"/>
         </w:numPr>
       </w:pPr>
       <w:r>
@@ -1311,7 +1687,7 @@
         <w:pStyle w:val="Compact"/>
         <w:numPr>
           <w:ilvl w:val="0"/>
-          <w:numId w:val="1003"/>
+          <w:numId w:val="1004"/>
         </w:numPr>
       </w:pPr>
       <w:r>
@@ -1365,7 +1741,7 @@
         <w:pStyle w:val="Compact"/>
         <w:numPr>
           <w:ilvl w:val="0"/>
-          <w:numId w:val="1003"/>
+          <w:numId w:val="1004"/>
         </w:numPr>
       </w:pPr>
       <w:r>
@@ -1405,7 +1781,7 @@
         <w:pStyle w:val="Compact"/>
         <w:numPr>
           <w:ilvl w:val="0"/>
-          <w:numId w:val="1003"/>
+          <w:numId w:val="1004"/>
         </w:numPr>
       </w:pPr>
       <w:r>
@@ -1465,7 +1841,7 @@
         <w:pStyle w:val="Compact"/>
         <w:numPr>
           <w:ilvl w:val="0"/>
-          <w:numId w:val="1003"/>
+          <w:numId w:val="1004"/>
         </w:numPr>
       </w:pPr>
       <w:r>
@@ -1505,7 +1881,7 @@
         <w:pStyle w:val="Compact"/>
         <w:numPr>
           <w:ilvl w:val="0"/>
-          <w:numId w:val="1003"/>
+          <w:numId w:val="1004"/>
         </w:numPr>
       </w:pPr>
       <w:r>
@@ -1683,7 +2059,7 @@
       <w:pPr>
         <w:numPr>
           <w:ilvl w:val="0"/>
-          <w:numId w:val="1004"/>
+          <w:numId w:val="1005"/>
         </w:numPr>
       </w:pPr>
       <w:r>
@@ -1722,7 +2098,7 @@
       <w:pPr>
         <w:numPr>
           <w:ilvl w:val="0"/>
-          <w:numId w:val="1004"/>
+          <w:numId w:val="1005"/>
         </w:numPr>
       </w:pPr>
       <w:r>
@@ -1781,7 +2157,7 @@
       <w:pPr>
         <w:numPr>
           <w:ilvl w:val="0"/>
-          <w:numId w:val="1004"/>
+          <w:numId w:val="1005"/>
         </w:numPr>
       </w:pPr>
       <w:r>
@@ -1802,7 +2178,7 @@
       <w:pPr>
         <w:numPr>
           <w:ilvl w:val="0"/>
-          <w:numId w:val="1004"/>
+          <w:numId w:val="1005"/>
         </w:numPr>
       </w:pPr>
       <w:r>
@@ -1869,7 +2245,7 @@
       <w:pPr>
         <w:numPr>
           <w:ilvl w:val="0"/>
-          <w:numId w:val="1004"/>
+          <w:numId w:val="1005"/>
         </w:numPr>
       </w:pPr>
       <w:r>
@@ -1909,7 +2285,7 @@
       <w:pPr>
         <w:numPr>
           <w:ilvl w:val="0"/>
-          <w:numId w:val="1004"/>
+          <w:numId w:val="1005"/>
         </w:numPr>
       </w:pPr>
       <w:r>
@@ -1936,7 +2312,7 @@
       <w:pPr>
         <w:numPr>
           <w:ilvl w:val="0"/>
-          <w:numId w:val="1004"/>
+          <w:numId w:val="1005"/>
         </w:numPr>
       </w:pPr>
       <w:r>
@@ -1992,7 +2368,7 @@
       <w:pPr>
         <w:numPr>
           <w:ilvl w:val="0"/>
-          <w:numId w:val="1004"/>
+          <w:numId w:val="1005"/>
         </w:numPr>
       </w:pPr>
       <w:r>
@@ -2150,7 +2526,7 @@
         <w:pStyle w:val="Compact"/>
         <w:numPr>
           <w:ilvl w:val="0"/>
-          <w:numId w:val="1005"/>
+          <w:numId w:val="1006"/>
         </w:numPr>
       </w:pPr>
       <w:r>
@@ -2178,7 +2554,7 @@
         <w:pStyle w:val="Compact"/>
         <w:numPr>
           <w:ilvl w:val="0"/>
-          <w:numId w:val="1005"/>
+          <w:numId w:val="1006"/>
         </w:numPr>
       </w:pPr>
       <w:r>
@@ -2200,7 +2576,7 @@
         <w:pStyle w:val="Compact"/>
         <w:numPr>
           <w:ilvl w:val="0"/>
-          <w:numId w:val="1005"/>
+          <w:numId w:val="1006"/>
         </w:numPr>
       </w:pPr>
       <w:r>
@@ -2222,7 +2598,7 @@
         <w:pStyle w:val="Compact"/>
         <w:numPr>
           <w:ilvl w:val="0"/>
-          <w:numId w:val="1005"/>
+          <w:numId w:val="1006"/>
         </w:numPr>
       </w:pPr>
       <w:r>
@@ -2250,7 +2626,7 @@
         <w:pStyle w:val="Compact"/>
         <w:numPr>
           <w:ilvl w:val="0"/>
-          <w:numId w:val="1005"/>
+          <w:numId w:val="1006"/>
         </w:numPr>
       </w:pPr>
       <w:r>
@@ -2272,7 +2648,7 @@
         <w:pStyle w:val="Compact"/>
         <w:numPr>
           <w:ilvl w:val="0"/>
-          <w:numId w:val="1005"/>
+          <w:numId w:val="1006"/>
         </w:numPr>
       </w:pPr>
       <w:r>
@@ -2294,7 +2670,7 @@
         <w:pStyle w:val="Compact"/>
         <w:numPr>
           <w:ilvl w:val="0"/>
-          <w:numId w:val="1005"/>
+          <w:numId w:val="1006"/>
         </w:numPr>
       </w:pPr>
       <w:r>
@@ -2328,7 +2704,7 @@
         <w:pStyle w:val="Compact"/>
         <w:numPr>
           <w:ilvl w:val="0"/>
-          <w:numId w:val="1005"/>
+          <w:numId w:val="1006"/>
         </w:numPr>
       </w:pPr>
       <w:r>
@@ -2350,7 +2726,7 @@
         <w:pStyle w:val="Compact"/>
         <w:numPr>
           <w:ilvl w:val="0"/>
-          <w:numId w:val="1005"/>
+          <w:numId w:val="1006"/>
         </w:numPr>
       </w:pPr>
       <w:r>
@@ -2372,7 +2748,7 @@
         <w:pStyle w:val="Compact"/>
         <w:numPr>
           <w:ilvl w:val="0"/>
-          <w:numId w:val="1005"/>
+          <w:numId w:val="1006"/>
         </w:numPr>
       </w:pPr>
       <w:r>
@@ -2406,7 +2782,7 @@
         <w:pStyle w:val="Compact"/>
         <w:numPr>
           <w:ilvl w:val="0"/>
-          <w:numId w:val="1005"/>
+          <w:numId w:val="1006"/>
         </w:numPr>
       </w:pPr>
       <w:r>
@@ -2881,7 +3257,7 @@
         <w:pStyle w:val="Compact"/>
         <w:numPr>
           <w:ilvl w:val="0"/>
-          <w:numId w:val="1006"/>
+          <w:numId w:val="1007"/>
         </w:numPr>
       </w:pPr>
       <w:r>
@@ -2959,7 +3335,7 @@
         <w:pStyle w:val="Compact"/>
         <w:numPr>
           <w:ilvl w:val="0"/>
-          <w:numId w:val="1006"/>
+          <w:numId w:val="1007"/>
         </w:numPr>
       </w:pPr>
       <w:r>
@@ -3140,7 +3516,7 @@
         <w:pStyle w:val="Compact"/>
         <w:numPr>
           <w:ilvl w:val="0"/>
-          <w:numId w:val="1007"/>
+          <w:numId w:val="1008"/>
         </w:numPr>
       </w:pPr>
       <w:r>
@@ -3192,7 +3568,7 @@
         <w:pStyle w:val="Compact"/>
         <w:numPr>
           <w:ilvl w:val="0"/>
-          <w:numId w:val="1007"/>
+          <w:numId w:val="1008"/>
         </w:numPr>
       </w:pPr>
       <w:r>
@@ -3248,7 +3624,7 @@
         <w:pStyle w:val="Compact"/>
         <w:numPr>
           <w:ilvl w:val="0"/>
-          <w:numId w:val="1007"/>
+          <w:numId w:val="1008"/>
         </w:numPr>
       </w:pPr>
       <w:r>
@@ -3346,7 +3722,7 @@
         <w:pStyle w:val="Compact"/>
         <w:numPr>
           <w:ilvl w:val="0"/>
-          <w:numId w:val="1008"/>
+          <w:numId w:val="1009"/>
         </w:numPr>
       </w:pPr>
       <w:r>
@@ -3380,7 +3756,7 @@
         <w:pStyle w:val="Compact"/>
         <w:numPr>
           <w:ilvl w:val="0"/>
-          <w:numId w:val="1008"/>
+          <w:numId w:val="1009"/>
         </w:numPr>
       </w:pPr>
       <w:r>
@@ -3488,7 +3864,7 @@
         <w:pStyle w:val="Compact"/>
         <w:numPr>
           <w:ilvl w:val="0"/>
-          <w:numId w:val="1008"/>
+          <w:numId w:val="1009"/>
         </w:numPr>
       </w:pPr>
       <w:r>
@@ -3763,7 +4139,7 @@
         <w:pStyle w:val="Compact"/>
         <w:numPr>
           <w:ilvl w:val="0"/>
-          <w:numId w:val="1009"/>
+          <w:numId w:val="1010"/>
         </w:numPr>
       </w:pPr>
       <w:r>
@@ -3871,7 +4247,7 @@
         <w:pStyle w:val="Compact"/>
         <w:numPr>
           <w:ilvl w:val="0"/>
-          <w:numId w:val="1009"/>
+          <w:numId w:val="1010"/>
         </w:numPr>
       </w:pPr>
       <w:r>
@@ -3989,7 +4365,7 @@
         <w:t xml:space="preserve"> </w:t>
       </w:r>
       <w:r>
-        <w:t xml:space="preserve">discard stale audio rather than competing indefinitely with the broadcast.</w:t>
+        <w:t xml:space="preserve">skip stale audio rather than competing indefinitely with the broadcast.</w:t>
       </w:r>
       <w:r>
         <w:t xml:space="preserve"> </w:t>
@@ -4197,7 +4573,7 @@
           <w:b/>
           <w:bCs/>
         </w:rPr>
-        <w:t xml:space="preserve">What changed in beta.8:</w:t>
+        <w:t xml:space="preserve">What changed since beta.7:</w:t>
       </w:r>
       <w:r>
         <w:t xml:space="preserve"> </w:t>
@@ -4209,43 +4585,61 @@
         <w:t xml:space="preserve"> </w:t>
       </w:r>
       <w:r>
-        <w:t xml:space="preserve">live captions on. Beta.8 includes repairs to caption processing, restart</w:t>
-      </w:r>
-      <w:r>
-        <w:t xml:space="preserve"> </w:t>
-      </w:r>
-      <w:r>
-        <w:t xml:space="preserve">timing and background cleanup. A short Blackwell test matched captions after</w:t>
-      </w:r>
-      <w:r>
-        <w:t xml:space="preserve"> </w:t>
-      </w:r>
-      <w:r>
-        <w:t xml:space="preserve">a controlled restart to text decoded from the outgoing video stream. A</w:t>
-      </w:r>
-      <w:r>
-        <w:t xml:space="preserve"> </w:t>
-      </w:r>
-      <w:r>
-        <w:t xml:space="preserve">separate test verified that the speech-recognition model loaded on the GPU.</w:t>
-      </w:r>
-      <w:r>
-        <w:t xml:space="preserve"> </w:t>
-      </w:r>
-      <w:r>
-        <w:t xml:space="preserve">These are bounded checks, not proof of uninterrupted all-day operation or</w:t>
-      </w:r>
-      <w:r>
-        <w:t xml:space="preserve"> </w:t>
-      </w:r>
-      <w:r>
-        <w:t xml:space="preserve">proof that every caption is correct. Startup overload remains a risk to watch;</w:t>
-      </w:r>
-      <w:r>
-        <w:t xml:space="preserve"> </w:t>
-      </w:r>
-      <w:r>
-        <w:t xml:space="preserve">the overload limit and two-minute initial pause have not been relaxed.</w:t>
+        <w:t xml:space="preserve">live captions on. The beta.10 candidate (which includes the unpublished beta.8</w:t>
+      </w:r>
+      <w:r>
+        <w:t xml:space="preserve"> </w:t>
+      </w:r>
+      <w:r>
+        <w:t xml:space="preserve">and beta.9 work) repairs caption processing, restart timing and background</w:t>
+      </w:r>
+      <w:r>
+        <w:t xml:space="preserve"> </w:t>
+      </w:r>
+      <w:r>
+        <w:t xml:space="preserve">cleanup, and a channel that falls behind now catches up by skipping its oldest</w:t>
+      </w:r>
+      <w:r>
+        <w:t xml:space="preserve"> </w:t>
+      </w:r>
+      <w:r>
+        <w:t xml:space="preserve">audio instead of pausing for minutes. A short Blackwell test matched captions</w:t>
+      </w:r>
+      <w:r>
+        <w:t xml:space="preserve"> </w:t>
+      </w:r>
+      <w:r>
+        <w:t xml:space="preserve">after a controlled restart to text decoded from the outgoing video stream, and</w:t>
+      </w:r>
+      <w:r>
+        <w:t xml:space="preserve"> </w:t>
+      </w:r>
+      <w:r>
+        <w:t xml:space="preserve">a separate test verified that the speech-recognition model loaded on the GPU.</w:t>
+      </w:r>
+      <w:r>
+        <w:t xml:space="preserve"> </w:t>
+      </w:r>
+      <w:r>
+        <w:t xml:space="preserve">In the eight-hour three-channel run the catch-up skipped caption audio 13</w:t>
+      </w:r>
+      <w:r>
+        <w:t xml:space="preserve"> </w:t>
+      </w:r>
+      <w:r>
+        <w:t xml:space="preserve">times (about 160 seconds on a quiet machine). These are bounded lab checks,</w:t>
+      </w:r>
+      <w:r>
+        <w:t xml:space="preserve"> </w:t>
+      </w:r>
+      <w:r>
+        <w:t xml:space="preserve">not proof of uninterrupted all-day operation or that every caption is</w:t>
+      </w:r>
+      <w:r>
+        <w:t xml:space="preserve"> </w:t>
+      </w:r>
+      <w:r>
+        <w:t xml:space="preserve">correct.</w:t>
       </w:r>
     </w:p>
     <w:p>
@@ -4394,37 +4788,55 @@
         <w:t xml:space="preserve"> </w:t>
       </w:r>
       <w:r>
-        <w:t xml:space="preserve">simply grind: it stops captioning that channel for a while (two minutes, then</w:t>
-      </w:r>
-      <w:r>
-        <w:t xml:space="preserve"> </w:t>
-      </w:r>
-      <w:r>
-        <w:t xml:space="preserve">four, then eight, up to fifteen), clears the captions that were on screen</w:t>
-      </w:r>
-      <w:r>
-        <w:t xml:space="preserve"> </w:t>
-      </w:r>
-      <w:r>
-        <w:t xml:space="preserve">rather than showing stale ones, and tries again later. You will see one</w:t>
-      </w:r>
-      <w:r>
-        <w:t xml:space="preserve"> </w:t>
-      </w:r>
-      <w:r>
-        <w:t xml:space="preserve">warning in the log each time that happens. Repeated warnings on the same</w:t>
-      </w:r>
-      <w:r>
-        <w:t xml:space="preserve"> </w:t>
-      </w:r>
-      <w:r>
-        <w:t xml:space="preserve">channel mean the live caption path is not keeping up under its current</w:t>
-      </w:r>
-      <w:r>
-        <w:t xml:space="preserve"> </w:t>
-      </w:r>
-      <w:r>
-        <w:t xml:space="preserve">conditions. Turn the switch off if necessary to protect the broadcast, retain</w:t>
+        <w:t xml:space="preserve">simply grind: a channel that falls behind keeps captioning from the newest</w:t>
+      </w:r>
+      <w:r>
+        <w:t xml:space="preserve"> </w:t>
+      </w:r>
+      <w:r>
+        <w:t xml:space="preserve">audio and skips only the oldest audio it could not have transcribed in time, so</w:t>
+      </w:r>
+      <w:r>
+        <w:t xml:space="preserve"> </w:t>
+      </w:r>
+      <w:r>
+        <w:t xml:space="preserve">a few seconds of speech go without a caption. You will see one warning in the</w:t>
+      </w:r>
+      <w:r>
+        <w:t xml:space="preserve"> </w:t>
+      </w:r>
+      <w:r>
+        <w:t xml:space="preserve">log each time that happens. A channel that has to do this three times in five</w:t>
+      </w:r>
+      <w:r>
+        <w:t xml:space="preserve"> </w:t>
+      </w:r>
+      <w:r>
+        <w:t xml:space="preserve">minutes is judged unable to keep up, and then CivicCast stops captioning it for</w:t>
+      </w:r>
+      <w:r>
+        <w:t xml:space="preserve"> </w:t>
+      </w:r>
+      <w:r>
+        <w:t xml:space="preserve">a while (two minutes, then four, then eight, up to fifteen), clears the</w:t>
+      </w:r>
+      <w:r>
+        <w:t xml:space="preserve"> </w:t>
+      </w:r>
+      <w:r>
+        <w:t xml:space="preserve">captions that were on screen rather than showing stale ones, and tries again</w:t>
+      </w:r>
+      <w:r>
+        <w:t xml:space="preserve"> </w:t>
+      </w:r>
+      <w:r>
+        <w:t xml:space="preserve">later. Repeated warnings on the same channel mean the live caption path is not</w:t>
+      </w:r>
+      <w:r>
+        <w:t xml:space="preserve"> </w:t>
+      </w:r>
+      <w:r>
+        <w:t xml:space="preserve">keeping up under its current conditions. Turn the switch off if necessary to protect the broadcast, retain</w:t>
       </w:r>
       <w:r>
         <w:t xml:space="preserve"> </w:t>
@@ -6947,7 +7359,7 @@
         <w:pStyle w:val="Compact"/>
         <w:numPr>
           <w:ilvl w:val="0"/>
-          <w:numId w:val="1010"/>
+          <w:numId w:val="1011"/>
         </w:numPr>
       </w:pPr>
       <w:r>
@@ -6993,7 +7405,7 @@
         <w:pStyle w:val="Compact"/>
         <w:numPr>
           <w:ilvl w:val="0"/>
-          <w:numId w:val="1010"/>
+          <w:numId w:val="1011"/>
         </w:numPr>
       </w:pPr>
       <w:r>
@@ -7023,7 +7435,7 @@
         <w:pStyle w:val="Compact"/>
         <w:numPr>
           <w:ilvl w:val="0"/>
-          <w:numId w:val="1010"/>
+          <w:numId w:val="1011"/>
         </w:numPr>
       </w:pPr>
       <w:r>
@@ -7035,7 +7447,7 @@
         <w:pStyle w:val="Compact"/>
         <w:numPr>
           <w:ilvl w:val="0"/>
-          <w:numId w:val="1010"/>
+          <w:numId w:val="1011"/>
         </w:numPr>
       </w:pPr>
       <w:r>
@@ -7063,7 +7475,7 @@
         <w:pStyle w:val="Compact"/>
         <w:numPr>
           <w:ilvl w:val="0"/>
-          <w:numId w:val="1010"/>
+          <w:numId w:val="1011"/>
         </w:numPr>
       </w:pPr>
       <w:r>
@@ -7121,7 +7533,7 @@
         <w:pStyle w:val="Compact"/>
         <w:numPr>
           <w:ilvl w:val="0"/>
-          <w:numId w:val="1011"/>
+          <w:numId w:val="1012"/>
         </w:numPr>
       </w:pPr>
       <w:r>
@@ -7199,7 +7611,7 @@
         <w:pStyle w:val="Compact"/>
         <w:numPr>
           <w:ilvl w:val="0"/>
-          <w:numId w:val="1011"/>
+          <w:numId w:val="1012"/>
         </w:numPr>
       </w:pPr>
       <w:r>
@@ -7223,7 +7635,7 @@
         <w:pStyle w:val="Compact"/>
         <w:numPr>
           <w:ilvl w:val="0"/>
-          <w:numId w:val="1011"/>
+          <w:numId w:val="1012"/>
         </w:numPr>
       </w:pPr>
       <w:r>
@@ -7288,7 +7700,7 @@
         <w:pStyle w:val="Compact"/>
         <w:numPr>
           <w:ilvl w:val="0"/>
-          <w:numId w:val="1012"/>
+          <w:numId w:val="1013"/>
         </w:numPr>
       </w:pPr>
       <w:hyperlink r:id="rId16">
@@ -7321,7 +7733,7 @@
         <w:pStyle w:val="Compact"/>
         <w:numPr>
           <w:ilvl w:val="0"/>
-          <w:numId w:val="1013"/>
+          <w:numId w:val="1014"/>
         </w:numPr>
       </w:pPr>
       <w:hyperlink r:id="rId14">
@@ -7354,7 +7766,7 @@
         <w:pStyle w:val="Compact"/>
         <w:numPr>
           <w:ilvl w:val="0"/>
-          <w:numId w:val="1014"/>
+          <w:numId w:val="1015"/>
         </w:numPr>
       </w:pPr>
       <w:hyperlink r:id="rId15">
@@ -7377,7 +7789,7 @@
         <w:pStyle w:val="Compact"/>
         <w:numPr>
           <w:ilvl w:val="0"/>
-          <w:numId w:val="1014"/>
+          <w:numId w:val="1015"/>
         </w:numPr>
       </w:pPr>
       <w:hyperlink r:id="rId49">
@@ -7568,7 +7980,7 @@
       <w:pPr>
         <w:numPr>
           <w:ilvl w:val="0"/>
-          <w:numId w:val="1015"/>
+          <w:numId w:val="1016"/>
         </w:numPr>
       </w:pPr>
       <w:r>
@@ -7791,7 +8203,7 @@
       <w:pPr>
         <w:numPr>
           <w:ilvl w:val="0"/>
-          <w:numId w:val="1015"/>
+          <w:numId w:val="1016"/>
         </w:numPr>
       </w:pPr>
       <w:r>
@@ -8109,7 +8521,7 @@
         <w:pStyle w:val="Compact"/>
         <w:numPr>
           <w:ilvl w:val="0"/>
-          <w:numId w:val="1016"/>
+          <w:numId w:val="1017"/>
         </w:numPr>
       </w:pPr>
       <w:r>
@@ -8127,7 +8539,7 @@
         <w:pStyle w:val="Compact"/>
         <w:numPr>
           <w:ilvl w:val="0"/>
-          <w:numId w:val="1016"/>
+          <w:numId w:val="1017"/>
         </w:numPr>
       </w:pPr>
       <w:r>
@@ -8145,7 +8557,7 @@
         <w:pStyle w:val="Compact"/>
         <w:numPr>
           <w:ilvl w:val="0"/>
-          <w:numId w:val="1016"/>
+          <w:numId w:val="1017"/>
         </w:numPr>
       </w:pPr>
       <w:r>
@@ -8208,7 +8620,7 @@
         <w:pStyle w:val="Compact"/>
         <w:numPr>
           <w:ilvl w:val="0"/>
-          <w:numId w:val="1016"/>
+          <w:numId w:val="1017"/>
         </w:numPr>
       </w:pPr>
       <w:r>
@@ -8256,7 +8668,7 @@
         <w:pStyle w:val="Compact"/>
         <w:numPr>
           <w:ilvl w:val="0"/>
-          <w:numId w:val="1016"/>
+          <w:numId w:val="1017"/>
         </w:numPr>
       </w:pPr>
       <w:r>
@@ -8847,7 +9259,7 @@
         <w:pStyle w:val="Compact"/>
         <w:numPr>
           <w:ilvl w:val="0"/>
-          <w:numId w:val="1017"/>
+          <w:numId w:val="1018"/>
         </w:numPr>
       </w:pPr>
       <w:r>
@@ -8870,7 +9282,7 @@
         <w:pStyle w:val="Compact"/>
         <w:numPr>
           <w:ilvl w:val="0"/>
-          <w:numId w:val="1017"/>
+          <w:numId w:val="1018"/>
         </w:numPr>
       </w:pPr>
       <w:r>
@@ -8902,7 +9314,7 @@
         <w:pStyle w:val="Compact"/>
         <w:numPr>
           <w:ilvl w:val="0"/>
-          <w:numId w:val="1017"/>
+          <w:numId w:val="1018"/>
         </w:numPr>
       </w:pPr>
       <w:r>
@@ -8925,7 +9337,7 @@
         <w:pStyle w:val="Compact"/>
         <w:numPr>
           <w:ilvl w:val="0"/>
-          <w:numId w:val="1017"/>
+          <w:numId w:val="1018"/>
         </w:numPr>
       </w:pPr>
       <w:r>
@@ -8960,7 +9372,7 @@
         <w:pStyle w:val="Compact"/>
         <w:numPr>
           <w:ilvl w:val="0"/>
-          <w:numId w:val="1017"/>
+          <w:numId w:val="1018"/>
         </w:numPr>
       </w:pPr>
       <w:r>
@@ -8998,7 +9410,7 @@
         <w:pStyle w:val="Compact"/>
         <w:numPr>
           <w:ilvl w:val="0"/>
-          <w:numId w:val="1017"/>
+          <w:numId w:val="1018"/>
         </w:numPr>
       </w:pPr>
       <w:r>
@@ -9027,7 +9439,7 @@
         <w:pStyle w:val="Compact"/>
         <w:numPr>
           <w:ilvl w:val="0"/>
-          <w:numId w:val="1017"/>
+          <w:numId w:val="1018"/>
         </w:numPr>
       </w:pPr>
       <w:r>
@@ -9050,7 +9462,7 @@
         <w:pStyle w:val="Compact"/>
         <w:numPr>
           <w:ilvl w:val="0"/>
-          <w:numId w:val="1017"/>
+          <w:numId w:val="1018"/>
         </w:numPr>
       </w:pPr>
       <w:r>
@@ -9073,7 +9485,7 @@
         <w:pStyle w:val="Compact"/>
         <w:numPr>
           <w:ilvl w:val="0"/>
-          <w:numId w:val="1017"/>
+          <w:numId w:val="1018"/>
         </w:numPr>
       </w:pPr>
       <w:r>
@@ -9096,7 +9508,7 @@
         <w:pStyle w:val="Compact"/>
         <w:numPr>
           <w:ilvl w:val="0"/>
-          <w:numId w:val="1017"/>
+          <w:numId w:val="1018"/>
         </w:numPr>
       </w:pPr>
       <w:r>
@@ -9119,7 +9531,7 @@
         <w:pStyle w:val="Compact"/>
         <w:numPr>
           <w:ilvl w:val="0"/>
-          <w:numId w:val="1017"/>
+          <w:numId w:val="1018"/>
         </w:numPr>
       </w:pPr>
       <w:r>
@@ -9142,7 +9554,7 @@
         <w:pStyle w:val="Compact"/>
         <w:numPr>
           <w:ilvl w:val="0"/>
-          <w:numId w:val="1017"/>
+          <w:numId w:val="1018"/>
         </w:numPr>
       </w:pPr>
       <w:r>
@@ -9165,7 +9577,7 @@
         <w:pStyle w:val="Compact"/>
         <w:numPr>
           <w:ilvl w:val="0"/>
-          <w:numId w:val="1017"/>
+          <w:numId w:val="1018"/>
         </w:numPr>
       </w:pPr>
       <w:r>
@@ -9198,7 +9610,7 @@
         <w:pStyle w:val="Compact"/>
         <w:numPr>
           <w:ilvl w:val="0"/>
-          <w:numId w:val="1017"/>
+          <w:numId w:val="1018"/>
         </w:numPr>
       </w:pPr>
       <w:r>
@@ -9241,7 +9653,7 @@
         <w:pStyle w:val="Compact"/>
         <w:numPr>
           <w:ilvl w:val="0"/>
-          <w:numId w:val="1018"/>
+          <w:numId w:val="1019"/>
         </w:numPr>
       </w:pPr>
       <w:r>
@@ -9291,7 +9703,7 @@
         <w:pStyle w:val="Compact"/>
         <w:numPr>
           <w:ilvl w:val="0"/>
-          <w:numId w:val="1018"/>
+          <w:numId w:val="1019"/>
         </w:numPr>
       </w:pPr>
       <w:r>
@@ -9314,7 +9726,7 @@
         <w:pStyle w:val="Compact"/>
         <w:numPr>
           <w:ilvl w:val="0"/>
-          <w:numId w:val="1018"/>
+          <w:numId w:val="1019"/>
         </w:numPr>
       </w:pPr>
       <w:r>
@@ -9347,7 +9759,7 @@
         <w:pStyle w:val="Compact"/>
         <w:numPr>
           <w:ilvl w:val="0"/>
-          <w:numId w:val="1018"/>
+          <w:numId w:val="1019"/>
         </w:numPr>
       </w:pPr>
       <w:r>
@@ -9370,7 +9782,7 @@
         <w:pStyle w:val="Compact"/>
         <w:numPr>
           <w:ilvl w:val="0"/>
-          <w:numId w:val="1018"/>
+          <w:numId w:val="1019"/>
         </w:numPr>
       </w:pPr>
       <w:r>
@@ -9405,7 +9817,7 @@
         <w:pStyle w:val="Compact"/>
         <w:numPr>
           <w:ilvl w:val="0"/>
-          <w:numId w:val="1018"/>
+          <w:numId w:val="1019"/>
         </w:numPr>
       </w:pPr>
       <w:r>
@@ -9440,7 +9852,7 @@
         <w:pStyle w:val="Compact"/>
         <w:numPr>
           <w:ilvl w:val="0"/>
-          <w:numId w:val="1018"/>
+          <w:numId w:val="1019"/>
         </w:numPr>
       </w:pPr>
       <w:r>
@@ -9485,7 +9897,7 @@
         <w:pStyle w:val="Compact"/>
         <w:numPr>
           <w:ilvl w:val="0"/>
-          <w:numId w:val="1019"/>
+          <w:numId w:val="1020"/>
         </w:numPr>
       </w:pPr>
       <w:r>
@@ -9538,7 +9950,7 @@
         <w:pStyle w:val="Compact"/>
         <w:numPr>
           <w:ilvl w:val="0"/>
-          <w:numId w:val="1019"/>
+          <w:numId w:val="1020"/>
         </w:numPr>
       </w:pPr>
       <w:r>
@@ -9561,7 +9973,90 @@
         <w:pStyle w:val="Compact"/>
         <w:numPr>
           <w:ilvl w:val="0"/>
-          <w:numId w:val="1019"/>
+          <w:numId w:val="1020"/>
+        </w:numPr>
+      </w:pPr>
+      <w:r>
+        <w:rPr>
+          <w:rStyle w:val="VerbatimChar"/>
+          <w:b/>
+          <w:bCs/>
+        </w:rPr>
+        <w:t xml:space="preserve">CIVICCAST_CONFORM_CACHE_GB</w:t>
+      </w:r>
+      <w:r>
+        <w:t xml:space="preserve"> </w:t>
+      </w:r>
+      <w:r>
+        <w:t xml:space="preserve">— Disk budget, in GB, for the conform cache (prepared copies of long programs kept under</w:t>
+      </w:r>
+      <w:r>
+        <w:t xml:space="preserve"> </w:t>
+      </w:r>
+      <w:r>
+        <w:rPr>
+          <w:rStyle w:val="VerbatimChar"/>
+        </w:rPr>
+        <w:t xml:space="preserve">conform-cache/</w:t>
+      </w:r>
+      <w:r>
+        <w:t xml:space="preserve"> </w:t>
+      </w:r>
+      <w:r>
+        <w:t xml:space="preserve">in the egress work directory so a program that has aired before starts within seconds). Default:</w:t>
+      </w:r>
+      <w:r>
+        <w:t xml:space="preserve"> </w:t>
+      </w:r>
+      <w:r>
+        <w:rPr>
+          <w:rStyle w:val="VerbatimChar"/>
+        </w:rPr>
+        <w:t xml:space="preserve">60</w:t>
+      </w:r>
+      <w:r>
+        <w:t xml:space="preserve"> </w:t>
+      </w:r>
+      <w:r>
+        <w:t xml:space="preserve">(it was</w:t>
+      </w:r>
+      <w:r>
+        <w:t xml:space="preserve"> </w:t>
+      </w:r>
+      <w:r>
+        <w:rPr>
+          <w:rStyle w:val="VerbatimChar"/>
+        </w:rPr>
+        <w:t xml:space="preserve">20</w:t>
+      </w:r>
+      <w:r>
+        <w:t xml:space="preserve"> </w:t>
+      </w:r>
+      <w:r>
+        <w:t xml:space="preserve">before beta.10);</w:t>
+      </w:r>
+      <w:r>
+        <w:t xml:space="preserve"> </w:t>
+      </w:r>
+      <w:r>
+        <w:rPr>
+          <w:rStyle w:val="VerbatimChar"/>
+        </w:rPr>
+        <w:t xml:space="preserve">0</w:t>
+      </w:r>
+      <w:r>
+        <w:t xml:space="preserve"> </w:t>
+      </w:r>
+      <w:r>
+        <w:t xml:space="preserve">disables the cache. Leave room on the data drive: one 4.4-hour program measured about 11 GB.</w:t>
+      </w:r>
+    </w:p>
+    <w:p>
+      <w:pPr>
+        <w:pStyle w:val="Compact"/>
+        <w:numPr>
+          <w:ilvl w:val="0"/>
+          <w:numId w:val="1020"/>
         </w:numPr>
       </w:pPr>
       <w:r>
@@ -9662,7 +10157,7 @@
         <w:pStyle w:val="Compact"/>
         <w:numPr>
           <w:ilvl w:val="0"/>
-          <w:numId w:val="1019"/>
+          <w:numId w:val="1020"/>
         </w:numPr>
       </w:pPr>
       <w:r>
@@ -9700,7 +10195,7 @@
         <w:pStyle w:val="Compact"/>
         <w:numPr>
           <w:ilvl w:val="0"/>
-          <w:numId w:val="1019"/>
+          <w:numId w:val="1020"/>
         </w:numPr>
       </w:pPr>
       <w:r>
@@ -9723,7 +10218,7 @@
         <w:pStyle w:val="Compact"/>
         <w:numPr>
           <w:ilvl w:val="0"/>
-          <w:numId w:val="1019"/>
+          <w:numId w:val="1020"/>
         </w:numPr>
       </w:pPr>
       <w:r>
@@ -9746,7 +10241,7 @@
         <w:pStyle w:val="Compact"/>
         <w:numPr>
           <w:ilvl w:val="0"/>
-          <w:numId w:val="1019"/>
+          <w:numId w:val="1020"/>
         </w:numPr>
       </w:pPr>
       <w:r>
@@ -9769,7 +10264,7 @@
         <w:pStyle w:val="Compact"/>
         <w:numPr>
           <w:ilvl w:val="0"/>
-          <w:numId w:val="1019"/>
+          <w:numId w:val="1020"/>
         </w:numPr>
       </w:pPr>
       <w:r>
@@ -9792,7 +10287,7 @@
         <w:pStyle w:val="Compact"/>
         <w:numPr>
           <w:ilvl w:val="0"/>
-          <w:numId w:val="1019"/>
+          <w:numId w:val="1020"/>
         </w:numPr>
       </w:pPr>
       <w:r>
@@ -9815,7 +10310,7 @@
         <w:pStyle w:val="Compact"/>
         <w:numPr>
           <w:ilvl w:val="0"/>
-          <w:numId w:val="1019"/>
+          <w:numId w:val="1020"/>
         </w:numPr>
       </w:pPr>
       <w:r>
@@ -9838,7 +10333,7 @@
         <w:pStyle w:val="Compact"/>
         <w:numPr>
           <w:ilvl w:val="0"/>
-          <w:numId w:val="1019"/>
+          <w:numId w:val="1020"/>
         </w:numPr>
       </w:pPr>
       <w:r>
@@ -9861,7 +10356,7 @@
         <w:pStyle w:val="Compact"/>
         <w:numPr>
           <w:ilvl w:val="0"/>
-          <w:numId w:val="1019"/>
+          <w:numId w:val="1020"/>
         </w:numPr>
       </w:pPr>
       <w:r>
@@ -9884,7 +10379,7 @@
         <w:pStyle w:val="Compact"/>
         <w:numPr>
           <w:ilvl w:val="0"/>
-          <w:numId w:val="1019"/>
+          <w:numId w:val="1020"/>
         </w:numPr>
       </w:pPr>
       <w:r>
@@ -9907,7 +10402,7 @@
         <w:pStyle w:val="Compact"/>
         <w:numPr>
           <w:ilvl w:val="0"/>
-          <w:numId w:val="1019"/>
+          <w:numId w:val="1020"/>
         </w:numPr>
       </w:pPr>
       <w:r>
@@ -9930,7 +10425,7 @@
         <w:pStyle w:val="Compact"/>
         <w:numPr>
           <w:ilvl w:val="0"/>
-          <w:numId w:val="1019"/>
+          <w:numId w:val="1020"/>
         </w:numPr>
       </w:pPr>
       <w:r>
@@ -9953,7 +10448,7 @@
         <w:pStyle w:val="Compact"/>
         <w:numPr>
           <w:ilvl w:val="0"/>
-          <w:numId w:val="1019"/>
+          <w:numId w:val="1020"/>
         </w:numPr>
       </w:pPr>
       <w:r>
@@ -9976,7 +10471,7 @@
         <w:pStyle w:val="Compact"/>
         <w:numPr>
           <w:ilvl w:val="0"/>
-          <w:numId w:val="1019"/>
+          <w:numId w:val="1020"/>
         </w:numPr>
       </w:pPr>
       <w:r>
@@ -9999,7 +10494,7 @@
         <w:pStyle w:val="Compact"/>
         <w:numPr>
           <w:ilvl w:val="0"/>
-          <w:numId w:val="1019"/>
+          <w:numId w:val="1020"/>
         </w:numPr>
       </w:pPr>
       <w:r>
@@ -10022,7 +10517,7 @@
         <w:pStyle w:val="Compact"/>
         <w:numPr>
           <w:ilvl w:val="0"/>
-          <w:numId w:val="1019"/>
+          <w:numId w:val="1020"/>
         </w:numPr>
       </w:pPr>
       <w:r>
@@ -10045,7 +10540,7 @@
         <w:pStyle w:val="Compact"/>
         <w:numPr>
           <w:ilvl w:val="0"/>
-          <w:numId w:val="1019"/>
+          <w:numId w:val="1020"/>
         </w:numPr>
       </w:pPr>
       <w:r>
@@ -10068,7 +10563,7 @@
         <w:pStyle w:val="Compact"/>
         <w:numPr>
           <w:ilvl w:val="0"/>
-          <w:numId w:val="1019"/>
+          <w:numId w:val="1020"/>
         </w:numPr>
       </w:pPr>
       <w:r>
@@ -10091,7 +10586,7 @@
         <w:pStyle w:val="Compact"/>
         <w:numPr>
           <w:ilvl w:val="0"/>
-          <w:numId w:val="1019"/>
+          <w:numId w:val="1020"/>
         </w:numPr>
       </w:pPr>
       <w:r>
@@ -10124,7 +10619,7 @@
         <w:pStyle w:val="Compact"/>
         <w:numPr>
           <w:ilvl w:val="0"/>
-          <w:numId w:val="1020"/>
+          <w:numId w:val="1021"/>
         </w:numPr>
       </w:pPr>
       <w:r>
@@ -10485,7 +10980,7 @@
         <w:pStyle w:val="Compact"/>
         <w:numPr>
           <w:ilvl w:val="0"/>
-          <w:numId w:val="1020"/>
+          <w:numId w:val="1021"/>
         </w:numPr>
       </w:pPr>
       <w:r>
@@ -10508,7 +11003,7 @@
         <w:pStyle w:val="Compact"/>
         <w:numPr>
           <w:ilvl w:val="0"/>
-          <w:numId w:val="1020"/>
+          <w:numId w:val="1021"/>
         </w:numPr>
       </w:pPr>
       <w:r>
@@ -10531,7 +11026,7 @@
         <w:pStyle w:val="Compact"/>
         <w:numPr>
           <w:ilvl w:val="0"/>
-          <w:numId w:val="1020"/>
+          <w:numId w:val="1021"/>
         </w:numPr>
       </w:pPr>
       <w:r>
@@ -10554,7 +11049,7 @@
         <w:pStyle w:val="Compact"/>
         <w:numPr>
           <w:ilvl w:val="0"/>
-          <w:numId w:val="1020"/>
+          <w:numId w:val="1021"/>
         </w:numPr>
       </w:pPr>
       <w:r>
@@ -10649,7 +11144,7 @@
         <w:pStyle w:val="Compact"/>
         <w:numPr>
           <w:ilvl w:val="0"/>
-          <w:numId w:val="1020"/>
+          <w:numId w:val="1021"/>
         </w:numPr>
       </w:pPr>
       <w:r>
@@ -10684,7 +11179,7 @@
         <w:pStyle w:val="Compact"/>
         <w:numPr>
           <w:ilvl w:val="0"/>
-          <w:numId w:val="1020"/>
+          <w:numId w:val="1021"/>
         </w:numPr>
       </w:pPr>
       <w:r>
@@ -10719,7 +11214,7 @@
         <w:pStyle w:val="Compact"/>
         <w:numPr>
           <w:ilvl w:val="0"/>
-          <w:numId w:val="1020"/>
+          <w:numId w:val="1021"/>
         </w:numPr>
       </w:pPr>
       <w:r>
@@ -10808,7 +11303,7 @@
         <w:pStyle w:val="Compact"/>
         <w:numPr>
           <w:ilvl w:val="0"/>
-          <w:numId w:val="1020"/>
+          <w:numId w:val="1021"/>
         </w:numPr>
       </w:pPr>
       <w:r>
@@ -10952,7 +11447,7 @@
         <w:pStyle w:val="Compact"/>
         <w:numPr>
           <w:ilvl w:val="0"/>
-          <w:numId w:val="1020"/>
+          <w:numId w:val="1021"/>
         </w:numPr>
       </w:pPr>
       <w:r>
@@ -10981,7 +11476,7 @@
         <w:pStyle w:val="Compact"/>
         <w:numPr>
           <w:ilvl w:val="0"/>
-          <w:numId w:val="1020"/>
+          <w:numId w:val="1021"/>
         </w:numPr>
       </w:pPr>
       <w:r>
@@ -11004,7 +11499,7 @@
         <w:pStyle w:val="Compact"/>
         <w:numPr>
           <w:ilvl w:val="0"/>
-          <w:numId w:val="1020"/>
+          <w:numId w:val="1021"/>
         </w:numPr>
       </w:pPr>
       <w:r>
@@ -11027,7 +11522,7 @@
         <w:pStyle w:val="Compact"/>
         <w:numPr>
           <w:ilvl w:val="0"/>
-          <w:numId w:val="1020"/>
+          <w:numId w:val="1021"/>
         </w:numPr>
       </w:pPr>
       <w:r>
@@ -11050,7 +11545,7 @@
         <w:pStyle w:val="Compact"/>
         <w:numPr>
           <w:ilvl w:val="0"/>
-          <w:numId w:val="1020"/>
+          <w:numId w:val="1021"/>
         </w:numPr>
       </w:pPr>
       <w:r>
@@ -11073,7 +11568,7 @@
         <w:pStyle w:val="Compact"/>
         <w:numPr>
           <w:ilvl w:val="0"/>
-          <w:numId w:val="1020"/>
+          <w:numId w:val="1021"/>
         </w:numPr>
       </w:pPr>
       <w:r>
@@ -11096,7 +11591,7 @@
         <w:pStyle w:val="Compact"/>
         <w:numPr>
           <w:ilvl w:val="0"/>
-          <w:numId w:val="1020"/>
+          <w:numId w:val="1021"/>
         </w:numPr>
       </w:pPr>
       <w:r>
@@ -11119,7 +11614,7 @@
         <w:pStyle w:val="Compact"/>
         <w:numPr>
           <w:ilvl w:val="0"/>
-          <w:numId w:val="1020"/>
+          <w:numId w:val="1021"/>
         </w:numPr>
       </w:pPr>
       <w:r>
@@ -11142,7 +11637,7 @@
         <w:pStyle w:val="Compact"/>
         <w:numPr>
           <w:ilvl w:val="0"/>
-          <w:numId w:val="1020"/>
+          <w:numId w:val="1021"/>
         </w:numPr>
       </w:pPr>
       <w:r>
@@ -11175,7 +11670,7 @@
         <w:pStyle w:val="Compact"/>
         <w:numPr>
           <w:ilvl w:val="0"/>
-          <w:numId w:val="1021"/>
+          <w:numId w:val="1022"/>
         </w:numPr>
       </w:pPr>
       <w:r>
@@ -11207,7 +11702,7 @@
         <w:pStyle w:val="Compact"/>
         <w:numPr>
           <w:ilvl w:val="0"/>
-          <w:numId w:val="1021"/>
+          <w:numId w:val="1022"/>
         </w:numPr>
       </w:pPr>
       <w:r>
@@ -11230,7 +11725,7 @@
         <w:pStyle w:val="Compact"/>
         <w:numPr>
           <w:ilvl w:val="0"/>
-          <w:numId w:val="1021"/>
+          <w:numId w:val="1022"/>
         </w:numPr>
       </w:pPr>
       <w:r>
@@ -11289,7 +11784,7 @@
         <w:pStyle w:val="Compact"/>
         <w:numPr>
           <w:ilvl w:val="0"/>
-          <w:numId w:val="1021"/>
+          <w:numId w:val="1022"/>
         </w:numPr>
       </w:pPr>
       <w:r>
@@ -11312,7 +11807,7 @@
         <w:pStyle w:val="Compact"/>
         <w:numPr>
           <w:ilvl w:val="0"/>
-          <w:numId w:val="1021"/>
+          <w:numId w:val="1022"/>
         </w:numPr>
       </w:pPr>
       <w:r>
@@ -11335,7 +11830,7 @@
         <w:pStyle w:val="Compact"/>
         <w:numPr>
           <w:ilvl w:val="0"/>
-          <w:numId w:val="1021"/>
+          <w:numId w:val="1022"/>
         </w:numPr>
       </w:pPr>
       <w:r>
@@ -11424,7 +11919,7 @@
         <w:pStyle w:val="Compact"/>
         <w:numPr>
           <w:ilvl w:val="0"/>
-          <w:numId w:val="1021"/>
+          <w:numId w:val="1022"/>
         </w:numPr>
       </w:pPr>
       <w:r>
@@ -11447,7 +11942,7 @@
         <w:pStyle w:val="Compact"/>
         <w:numPr>
           <w:ilvl w:val="0"/>
-          <w:numId w:val="1021"/>
+          <w:numId w:val="1022"/>
         </w:numPr>
       </w:pPr>
       <w:r>
@@ -11470,7 +11965,7 @@
         <w:pStyle w:val="Compact"/>
         <w:numPr>
           <w:ilvl w:val="0"/>
-          <w:numId w:val="1021"/>
+          <w:numId w:val="1022"/>
         </w:numPr>
       </w:pPr>
       <w:r>
@@ -11493,7 +11988,7 @@
         <w:pStyle w:val="Compact"/>
         <w:numPr>
           <w:ilvl w:val="0"/>
-          <w:numId w:val="1021"/>
+          <w:numId w:val="1022"/>
         </w:numPr>
       </w:pPr>
       <w:r>
@@ -11516,7 +12011,7 @@
         <w:pStyle w:val="Compact"/>
         <w:numPr>
           <w:ilvl w:val="0"/>
-          <w:numId w:val="1021"/>
+          <w:numId w:val="1022"/>
         </w:numPr>
       </w:pPr>
       <w:r>
@@ -11539,7 +12034,7 @@
         <w:pStyle w:val="Compact"/>
         <w:numPr>
           <w:ilvl w:val="0"/>
-          <w:numId w:val="1021"/>
+          <w:numId w:val="1022"/>
         </w:numPr>
       </w:pPr>
       <w:r>
@@ -11562,7 +12057,7 @@
         <w:pStyle w:val="Compact"/>
         <w:numPr>
           <w:ilvl w:val="0"/>
-          <w:numId w:val="1021"/>
+          <w:numId w:val="1022"/>
         </w:numPr>
       </w:pPr>
       <w:r>
@@ -11585,7 +12080,7 @@
         <w:pStyle w:val="Compact"/>
         <w:numPr>
           <w:ilvl w:val="0"/>
-          <w:numId w:val="1021"/>
+          <w:numId w:val="1022"/>
         </w:numPr>
       </w:pPr>
       <w:r>
@@ -11618,7 +12113,7 @@
         <w:pStyle w:val="Compact"/>
         <w:numPr>
           <w:ilvl w:val="0"/>
-          <w:numId w:val="1022"/>
+          <w:numId w:val="1023"/>
         </w:numPr>
       </w:pPr>
       <w:r>
@@ -11641,7 +12136,7 @@
         <w:pStyle w:val="Compact"/>
         <w:numPr>
           <w:ilvl w:val="0"/>
-          <w:numId w:val="1022"/>
+          <w:numId w:val="1023"/>
         </w:numPr>
       </w:pPr>
       <w:r>
@@ -11673,7 +12168,7 @@
         <w:pStyle w:val="Compact"/>
         <w:numPr>
           <w:ilvl w:val="0"/>
-          <w:numId w:val="1022"/>
+          <w:numId w:val="1023"/>
         </w:numPr>
       </w:pPr>
       <w:r>
@@ -11696,7 +12191,7 @@
         <w:pStyle w:val="Compact"/>
         <w:numPr>
           <w:ilvl w:val="0"/>
-          <w:numId w:val="1022"/>
+          <w:numId w:val="1023"/>
         </w:numPr>
       </w:pPr>
       <w:r>
@@ -11764,7 +12259,7 @@
         <w:pStyle w:val="Compact"/>
         <w:numPr>
           <w:ilvl w:val="0"/>
-          <w:numId w:val="1023"/>
+          <w:numId w:val="1024"/>
         </w:numPr>
       </w:pPr>
       <w:r>
@@ -11814,7 +12309,7 @@
         <w:pStyle w:val="Compact"/>
         <w:numPr>
           <w:ilvl w:val="0"/>
-          <w:numId w:val="1023"/>
+          <w:numId w:val="1024"/>
         </w:numPr>
       </w:pPr>
       <w:r>
@@ -11864,7 +12359,7 @@
         <w:pStyle w:val="Compact"/>
         <w:numPr>
           <w:ilvl w:val="0"/>
-          <w:numId w:val="1023"/>
+          <w:numId w:val="1024"/>
         </w:numPr>
       </w:pPr>
       <w:r>
@@ -11914,7 +12409,7 @@
         <w:pStyle w:val="Compact"/>
         <w:numPr>
           <w:ilvl w:val="0"/>
-          <w:numId w:val="1023"/>
+          <w:numId w:val="1024"/>
         </w:numPr>
       </w:pPr>
       <w:r>
@@ -11964,7 +12459,7 @@
         <w:pStyle w:val="Compact"/>
         <w:numPr>
           <w:ilvl w:val="0"/>
-          <w:numId w:val="1023"/>
+          <w:numId w:val="1024"/>
         </w:numPr>
       </w:pPr>
       <w:r>
@@ -12014,7 +12509,7 @@
         <w:pStyle w:val="Compact"/>
         <w:numPr>
           <w:ilvl w:val="0"/>
-          <w:numId w:val="1023"/>
+          <w:numId w:val="1024"/>
         </w:numPr>
       </w:pPr>
       <w:r>
@@ -12037,7 +12532,7 @@
         <w:pStyle w:val="Compact"/>
         <w:numPr>
           <w:ilvl w:val="0"/>
-          <w:numId w:val="1023"/>
+          <w:numId w:val="1024"/>
         </w:numPr>
       </w:pPr>
       <w:r>
@@ -12060,7 +12555,7 @@
         <w:pStyle w:val="Compact"/>
         <w:numPr>
           <w:ilvl w:val="0"/>
-          <w:numId w:val="1023"/>
+          <w:numId w:val="1024"/>
         </w:numPr>
       </w:pPr>
       <w:r>
@@ -12083,7 +12578,7 @@
         <w:pStyle w:val="Compact"/>
         <w:numPr>
           <w:ilvl w:val="0"/>
-          <w:numId w:val="1023"/>
+          <w:numId w:val="1024"/>
         </w:numPr>
       </w:pPr>
       <w:r>
@@ -12106,7 +12601,7 @@
         <w:pStyle w:val="Compact"/>
         <w:numPr>
           <w:ilvl w:val="0"/>
-          <w:numId w:val="1023"/>
+          <w:numId w:val="1024"/>
         </w:numPr>
       </w:pPr>
       <w:r>
@@ -12129,7 +12624,7 @@
         <w:pStyle w:val="Compact"/>
         <w:numPr>
           <w:ilvl w:val="0"/>
-          <w:numId w:val="1023"/>
+          <w:numId w:val="1024"/>
         </w:numPr>
       </w:pPr>
       <w:r>
@@ -12152,7 +12647,7 @@
         <w:pStyle w:val="Compact"/>
         <w:numPr>
           <w:ilvl w:val="0"/>
-          <w:numId w:val="1023"/>
+          <w:numId w:val="1024"/>
         </w:numPr>
       </w:pPr>
       <w:r>
@@ -12175,7 +12670,7 @@
         <w:pStyle w:val="Compact"/>
         <w:numPr>
           <w:ilvl w:val="0"/>
-          <w:numId w:val="1023"/>
+          <w:numId w:val="1024"/>
         </w:numPr>
       </w:pPr>
       <w:r>
@@ -12198,7 +12693,7 @@
         <w:pStyle w:val="Compact"/>
         <w:numPr>
           <w:ilvl w:val="0"/>
-          <w:numId w:val="1023"/>
+          <w:numId w:val="1024"/>
         </w:numPr>
       </w:pPr>
       <w:r>
@@ -12221,7 +12716,7 @@
         <w:pStyle w:val="Compact"/>
         <w:numPr>
           <w:ilvl w:val="0"/>
-          <w:numId w:val="1023"/>
+          <w:numId w:val="1024"/>
         </w:numPr>
       </w:pPr>
       <w:r>
@@ -12244,7 +12739,7 @@
         <w:pStyle w:val="Compact"/>
         <w:numPr>
           <w:ilvl w:val="0"/>
-          <w:numId w:val="1023"/>
+          <w:numId w:val="1024"/>
         </w:numPr>
       </w:pPr>
       <w:r>
@@ -12267,7 +12762,7 @@
         <w:pStyle w:val="Compact"/>
         <w:numPr>
           <w:ilvl w:val="0"/>
-          <w:numId w:val="1023"/>
+          <w:numId w:val="1024"/>
         </w:numPr>
       </w:pPr>
       <w:r>
@@ -12290,7 +12785,7 @@
         <w:pStyle w:val="Compact"/>
         <w:numPr>
           <w:ilvl w:val="0"/>
-          <w:numId w:val="1023"/>
+          <w:numId w:val="1024"/>
         </w:numPr>
       </w:pPr>
       <w:r>
@@ -12313,7 +12808,7 @@
         <w:pStyle w:val="Compact"/>
         <w:numPr>
           <w:ilvl w:val="0"/>
-          <w:numId w:val="1023"/>
+          <w:numId w:val="1024"/>
         </w:numPr>
       </w:pPr>
       <w:r>
@@ -12336,7 +12831,7 @@
         <w:pStyle w:val="Compact"/>
         <w:numPr>
           <w:ilvl w:val="0"/>
-          <w:numId w:val="1023"/>
+          <w:numId w:val="1024"/>
         </w:numPr>
       </w:pPr>
       <w:r>
@@ -12359,7 +12854,7 @@
         <w:pStyle w:val="Compact"/>
         <w:numPr>
           <w:ilvl w:val="0"/>
-          <w:numId w:val="1023"/>
+          <w:numId w:val="1024"/>
         </w:numPr>
       </w:pPr>
       <w:r>
@@ -12382,7 +12877,7 @@
         <w:pStyle w:val="Compact"/>
         <w:numPr>
           <w:ilvl w:val="0"/>
-          <w:numId w:val="1023"/>
+          <w:numId w:val="1024"/>
         </w:numPr>
       </w:pPr>
       <w:r>
@@ -12405,7 +12900,7 @@
         <w:pStyle w:val="Compact"/>
         <w:numPr>
           <w:ilvl w:val="0"/>
-          <w:numId w:val="1023"/>
+          <w:numId w:val="1024"/>
         </w:numPr>
       </w:pPr>
       <w:r>
@@ -12428,7 +12923,7 @@
         <w:pStyle w:val="Compact"/>
         <w:numPr>
           <w:ilvl w:val="0"/>
-          <w:numId w:val="1023"/>
+          <w:numId w:val="1024"/>
         </w:numPr>
       </w:pPr>
       <w:r>
@@ -12451,7 +12946,7 @@
         <w:pStyle w:val="Compact"/>
         <w:numPr>
           <w:ilvl w:val="0"/>
-          <w:numId w:val="1023"/>
+          <w:numId w:val="1024"/>
         </w:numPr>
       </w:pPr>
       <w:r>
@@ -12474,7 +12969,7 @@
         <w:pStyle w:val="Compact"/>
         <w:numPr>
           <w:ilvl w:val="0"/>
-          <w:numId w:val="1023"/>
+          <w:numId w:val="1024"/>
         </w:numPr>
       </w:pPr>
       <w:r>
@@ -12497,7 +12992,7 @@
         <w:pStyle w:val="Compact"/>
         <w:numPr>
           <w:ilvl w:val="0"/>
-          <w:numId w:val="1023"/>
+          <w:numId w:val="1024"/>
         </w:numPr>
       </w:pPr>
       <w:r>
@@ -12520,7 +13015,7 @@
         <w:pStyle w:val="Compact"/>
         <w:numPr>
           <w:ilvl w:val="0"/>
-          <w:numId w:val="1023"/>
+          <w:numId w:val="1024"/>
         </w:numPr>
       </w:pPr>
       <w:r>
@@ -12543,7 +13038,7 @@
         <w:pStyle w:val="Compact"/>
         <w:numPr>
           <w:ilvl w:val="0"/>
-          <w:numId w:val="1023"/>
+          <w:numId w:val="1024"/>
         </w:numPr>
       </w:pPr>
       <w:r>
@@ -12566,7 +13061,7 @@
         <w:pStyle w:val="Compact"/>
         <w:numPr>
           <w:ilvl w:val="0"/>
-          <w:numId w:val="1023"/>
+          <w:numId w:val="1024"/>
         </w:numPr>
       </w:pPr>
       <w:r>
@@ -12599,7 +13094,7 @@
         <w:pStyle w:val="Compact"/>
         <w:numPr>
           <w:ilvl w:val="0"/>
-          <w:numId w:val="1024"/>
+          <w:numId w:val="1025"/>
         </w:numPr>
       </w:pPr>
       <w:r>
@@ -12622,7 +13117,7 @@
         <w:pStyle w:val="Compact"/>
         <w:numPr>
           <w:ilvl w:val="0"/>
-          <w:numId w:val="1024"/>
+          <w:numId w:val="1025"/>
         </w:numPr>
       </w:pPr>
       <w:r>
@@ -12645,7 +13140,7 @@
         <w:pStyle w:val="Compact"/>
         <w:numPr>
           <w:ilvl w:val="0"/>
-          <w:numId w:val="1024"/>
+          <w:numId w:val="1025"/>
         </w:numPr>
       </w:pPr>
       <w:r>
@@ -12668,7 +13163,7 @@
         <w:pStyle w:val="Compact"/>
         <w:numPr>
           <w:ilvl w:val="0"/>
-          <w:numId w:val="1024"/>
+          <w:numId w:val="1025"/>
         </w:numPr>
       </w:pPr>
       <w:r>
@@ -12691,7 +13186,7 @@
         <w:pStyle w:val="Compact"/>
         <w:numPr>
           <w:ilvl w:val="0"/>
-          <w:numId w:val="1024"/>
+          <w:numId w:val="1025"/>
         </w:numPr>
       </w:pPr>
       <w:r>
@@ -12714,7 +13209,7 @@
         <w:pStyle w:val="Compact"/>
         <w:numPr>
           <w:ilvl w:val="0"/>
-          <w:numId w:val="1024"/>
+          <w:numId w:val="1025"/>
         </w:numPr>
       </w:pPr>
       <w:r>
@@ -12737,7 +13232,7 @@
         <w:pStyle w:val="Compact"/>
         <w:numPr>
           <w:ilvl w:val="0"/>
-          <w:numId w:val="1024"/>
+          <w:numId w:val="1025"/>
         </w:numPr>
       </w:pPr>
       <w:r>
@@ -12760,7 +13255,7 @@
         <w:pStyle w:val="Compact"/>
         <w:numPr>
           <w:ilvl w:val="0"/>
-          <w:numId w:val="1024"/>
+          <w:numId w:val="1025"/>
         </w:numPr>
       </w:pPr>
       <w:r>
@@ -12783,7 +13278,7 @@
         <w:pStyle w:val="Compact"/>
         <w:numPr>
           <w:ilvl w:val="0"/>
-          <w:numId w:val="1024"/>
+          <w:numId w:val="1025"/>
         </w:numPr>
       </w:pPr>
       <w:r>
@@ -12806,7 +13301,7 @@
         <w:pStyle w:val="Compact"/>
         <w:numPr>
           <w:ilvl w:val="0"/>
-          <w:numId w:val="1024"/>
+          <w:numId w:val="1025"/>
         </w:numPr>
       </w:pPr>
       <w:r>
@@ -12829,7 +13324,7 @@
         <w:pStyle w:val="Compact"/>
         <w:numPr>
           <w:ilvl w:val="0"/>
-          <w:numId w:val="1024"/>
+          <w:numId w:val="1025"/>
         </w:numPr>
       </w:pPr>
       <w:r>
@@ -12852,7 +13347,7 @@
         <w:pStyle w:val="Compact"/>
         <w:numPr>
           <w:ilvl w:val="0"/>
-          <w:numId w:val="1024"/>
+          <w:numId w:val="1025"/>
         </w:numPr>
       </w:pPr>
       <w:r>
@@ -12875,7 +13370,7 @@
         <w:pStyle w:val="Compact"/>
         <w:numPr>
           <w:ilvl w:val="0"/>
-          <w:numId w:val="1024"/>
+          <w:numId w:val="1025"/>
         </w:numPr>
       </w:pPr>
       <w:r>
@@ -12898,7 +13393,7 @@
         <w:pStyle w:val="Compact"/>
         <w:numPr>
           <w:ilvl w:val="0"/>
-          <w:numId w:val="1024"/>
+          <w:numId w:val="1025"/>
         </w:numPr>
       </w:pPr>
       <w:r>
@@ -12921,7 +13416,7 @@
         <w:pStyle w:val="Compact"/>
         <w:numPr>
           <w:ilvl w:val="0"/>
-          <w:numId w:val="1024"/>
+          <w:numId w:val="1025"/>
         </w:numPr>
       </w:pPr>
       <w:r>
@@ -12977,7 +13472,7 @@
         <w:pStyle w:val="Compact"/>
         <w:numPr>
           <w:ilvl w:val="0"/>
-          <w:numId w:val="1025"/>
+          <w:numId w:val="1026"/>
         </w:numPr>
       </w:pPr>
       <w:r>
@@ -13000,7 +13495,7 @@
         <w:pStyle w:val="Compact"/>
         <w:numPr>
           <w:ilvl w:val="0"/>
-          <w:numId w:val="1025"/>
+          <w:numId w:val="1026"/>
         </w:numPr>
       </w:pPr>
       <w:r>
@@ -13023,7 +13518,7 @@
         <w:pStyle w:val="Compact"/>
         <w:numPr>
           <w:ilvl w:val="0"/>
-          <w:numId w:val="1025"/>
+          <w:numId w:val="1026"/>
         </w:numPr>
       </w:pPr>
       <w:r>
@@ -13046,7 +13541,7 @@
         <w:pStyle w:val="Compact"/>
         <w:numPr>
           <w:ilvl w:val="0"/>
-          <w:numId w:val="1025"/>
+          <w:numId w:val="1026"/>
         </w:numPr>
       </w:pPr>
       <w:r>
@@ -13069,7 +13564,7 @@
         <w:pStyle w:val="Compact"/>
         <w:numPr>
           <w:ilvl w:val="0"/>
-          <w:numId w:val="1025"/>
+          <w:numId w:val="1026"/>
         </w:numPr>
       </w:pPr>
       <w:r>
@@ -13092,7 +13587,7 @@
         <w:pStyle w:val="Compact"/>
         <w:numPr>
           <w:ilvl w:val="0"/>
-          <w:numId w:val="1025"/>
+          <w:numId w:val="1026"/>
         </w:numPr>
       </w:pPr>
       <w:r>
@@ -13115,7 +13610,7 @@
         <w:pStyle w:val="Compact"/>
         <w:numPr>
           <w:ilvl w:val="0"/>
-          <w:numId w:val="1025"/>
+          <w:numId w:val="1026"/>
         </w:numPr>
       </w:pPr>
       <w:r>
@@ -13148,7 +13643,7 @@
         <w:pStyle w:val="Compact"/>
         <w:numPr>
           <w:ilvl w:val="0"/>
-          <w:numId w:val="1026"/>
+          <w:numId w:val="1027"/>
         </w:numPr>
       </w:pPr>
       <w:r>
@@ -13207,7 +13702,7 @@
         <w:pStyle w:val="Compact"/>
         <w:numPr>
           <w:ilvl w:val="0"/>
-          <w:numId w:val="1026"/>
+          <w:numId w:val="1027"/>
         </w:numPr>
       </w:pPr>
       <w:r>
@@ -13230,7 +13725,7 @@
         <w:pStyle w:val="Compact"/>
         <w:numPr>
           <w:ilvl w:val="0"/>
-          <w:numId w:val="1026"/>
+          <w:numId w:val="1027"/>
         </w:numPr>
       </w:pPr>
       <w:r>
@@ -13253,7 +13748,7 @@
         <w:pStyle w:val="Compact"/>
         <w:numPr>
           <w:ilvl w:val="0"/>
-          <w:numId w:val="1026"/>
+          <w:numId w:val="1027"/>
         </w:numPr>
       </w:pPr>
       <w:r>
@@ -13276,7 +13771,7 @@
         <w:pStyle w:val="Compact"/>
         <w:numPr>
           <w:ilvl w:val="0"/>
-          <w:numId w:val="1026"/>
+          <w:numId w:val="1027"/>
         </w:numPr>
       </w:pPr>
       <w:r>
@@ -13299,7 +13794,7 @@
         <w:pStyle w:val="Compact"/>
         <w:numPr>
           <w:ilvl w:val="0"/>
-          <w:numId w:val="1026"/>
+          <w:numId w:val="1027"/>
         </w:numPr>
       </w:pPr>
       <w:r>
@@ -13322,7 +13817,7 @@
         <w:pStyle w:val="Compact"/>
         <w:numPr>
           <w:ilvl w:val="0"/>
-          <w:numId w:val="1026"/>
+          <w:numId w:val="1027"/>
         </w:numPr>
       </w:pPr>
       <w:r>
@@ -13345,7 +13840,7 @@
         <w:pStyle w:val="Compact"/>
         <w:numPr>
           <w:ilvl w:val="0"/>
-          <w:numId w:val="1026"/>
+          <w:numId w:val="1027"/>
         </w:numPr>
       </w:pPr>
       <w:r>
@@ -13368,7 +13863,7 @@
         <w:pStyle w:val="Compact"/>
         <w:numPr>
           <w:ilvl w:val="0"/>
-          <w:numId w:val="1026"/>
+          <w:numId w:val="1027"/>
         </w:numPr>
       </w:pPr>
       <w:r>
@@ -13391,7 +13886,7 @@
         <w:pStyle w:val="Compact"/>
         <w:numPr>
           <w:ilvl w:val="0"/>
-          <w:numId w:val="1026"/>
+          <w:numId w:val="1027"/>
         </w:numPr>
       </w:pPr>
       <w:r>
@@ -13414,7 +13909,7 @@
         <w:pStyle w:val="Compact"/>
         <w:numPr>
           <w:ilvl w:val="0"/>
-          <w:numId w:val="1026"/>
+          <w:numId w:val="1027"/>
         </w:numPr>
       </w:pPr>
       <w:r>
@@ -13437,7 +13932,7 @@
         <w:pStyle w:val="Compact"/>
         <w:numPr>
           <w:ilvl w:val="0"/>
-          <w:numId w:val="1026"/>
+          <w:numId w:val="1027"/>
         </w:numPr>
       </w:pPr>
       <w:r>
@@ -13460,7 +13955,7 @@
         <w:pStyle w:val="Compact"/>
         <w:numPr>
           <w:ilvl w:val="0"/>
-          <w:numId w:val="1026"/>
+          <w:numId w:val="1027"/>
         </w:numPr>
       </w:pPr>
       <w:r>
@@ -13483,7 +13978,7 @@
         <w:pStyle w:val="Compact"/>
         <w:numPr>
           <w:ilvl w:val="0"/>
-          <w:numId w:val="1026"/>
+          <w:numId w:val="1027"/>
         </w:numPr>
       </w:pPr>
       <w:r>
@@ -13506,7 +14001,7 @@
         <w:pStyle w:val="Compact"/>
         <w:numPr>
           <w:ilvl w:val="0"/>
-          <w:numId w:val="1026"/>
+          <w:numId w:val="1027"/>
         </w:numPr>
       </w:pPr>
       <w:r>
@@ -13529,7 +14024,7 @@
         <w:pStyle w:val="Compact"/>
         <w:numPr>
           <w:ilvl w:val="0"/>
-          <w:numId w:val="1026"/>
+          <w:numId w:val="1027"/>
         </w:numPr>
       </w:pPr>
       <w:r>
@@ -13552,7 +14047,7 @@
         <w:pStyle w:val="Compact"/>
         <w:numPr>
           <w:ilvl w:val="0"/>
-          <w:numId w:val="1026"/>
+          <w:numId w:val="1027"/>
         </w:numPr>
       </w:pPr>
       <w:r>
@@ -13575,7 +14070,7 @@
         <w:pStyle w:val="Compact"/>
         <w:numPr>
           <w:ilvl w:val="0"/>
-          <w:numId w:val="1026"/>
+          <w:numId w:val="1027"/>
         </w:numPr>
       </w:pPr>
       <w:r>
@@ -13608,7 +14103,7 @@
         <w:pStyle w:val="Compact"/>
         <w:numPr>
           <w:ilvl w:val="0"/>
-          <w:numId w:val="1027"/>
+          <w:numId w:val="1028"/>
         </w:numPr>
       </w:pPr>
       <w:r>
@@ -13631,7 +14126,7 @@
         <w:pStyle w:val="Compact"/>
         <w:numPr>
           <w:ilvl w:val="0"/>
-          <w:numId w:val="1027"/>
+          <w:numId w:val="1028"/>
         </w:numPr>
       </w:pPr>
       <w:r>
@@ -13654,7 +14149,7 @@
         <w:pStyle w:val="Compact"/>
         <w:numPr>
           <w:ilvl w:val="0"/>
-          <w:numId w:val="1027"/>
+          <w:numId w:val="1028"/>
         </w:numPr>
       </w:pPr>
       <w:r>
@@ -13677,7 +14172,7 @@
         <w:pStyle w:val="Compact"/>
         <w:numPr>
           <w:ilvl w:val="0"/>
-          <w:numId w:val="1027"/>
+          <w:numId w:val="1028"/>
         </w:numPr>
       </w:pPr>
       <w:r>
@@ -13700,7 +14195,7 @@
         <w:pStyle w:val="Compact"/>
         <w:numPr>
           <w:ilvl w:val="0"/>
-          <w:numId w:val="1027"/>
+          <w:numId w:val="1028"/>
         </w:numPr>
       </w:pPr>
       <w:r>
@@ -13723,7 +14218,7 @@
         <w:pStyle w:val="Compact"/>
         <w:numPr>
           <w:ilvl w:val="0"/>
-          <w:numId w:val="1027"/>
+          <w:numId w:val="1028"/>
         </w:numPr>
       </w:pPr>
       <w:r>
@@ -13746,7 +14241,7 @@
         <w:pStyle w:val="Compact"/>
         <w:numPr>
           <w:ilvl w:val="0"/>
-          <w:numId w:val="1027"/>
+          <w:numId w:val="1028"/>
         </w:numPr>
       </w:pPr>
       <w:r>
@@ -13784,7 +14279,7 @@
         <w:pStyle w:val="Compact"/>
         <w:numPr>
           <w:ilvl w:val="0"/>
-          <w:numId w:val="1027"/>
+          <w:numId w:val="1028"/>
         </w:numPr>
       </w:pPr>
       <w:r>
@@ -13822,7 +14317,7 @@
         <w:pStyle w:val="Compact"/>
         <w:numPr>
           <w:ilvl w:val="0"/>
-          <w:numId w:val="1027"/>
+          <w:numId w:val="1028"/>
         </w:numPr>
       </w:pPr>
       <w:r>
@@ -13860,7 +14355,7 @@
         <w:pStyle w:val="Compact"/>
         <w:numPr>
           <w:ilvl w:val="0"/>
-          <w:numId w:val="1027"/>
+          <w:numId w:val="1028"/>
         </w:numPr>
       </w:pPr>
       <w:r>
@@ -13898,7 +14393,7 @@
         <w:pStyle w:val="Compact"/>
         <w:numPr>
           <w:ilvl w:val="0"/>
-          <w:numId w:val="1027"/>
+          <w:numId w:val="1028"/>
         </w:numPr>
       </w:pPr>
       <w:r>
@@ -13921,7 +14416,7 @@
         <w:pStyle w:val="Compact"/>
         <w:numPr>
           <w:ilvl w:val="0"/>
-          <w:numId w:val="1027"/>
+          <w:numId w:val="1028"/>
         </w:numPr>
       </w:pPr>
       <w:r>
@@ -13954,7 +14449,7 @@
         <w:pStyle w:val="Compact"/>
         <w:numPr>
           <w:ilvl w:val="0"/>
-          <w:numId w:val="1028"/>
+          <w:numId w:val="1029"/>
         </w:numPr>
       </w:pPr>
       <w:r>
@@ -13977,7 +14472,7 @@
         <w:pStyle w:val="Compact"/>
         <w:numPr>
           <w:ilvl w:val="0"/>
-          <w:numId w:val="1028"/>
+          <w:numId w:val="1029"/>
         </w:numPr>
       </w:pPr>
       <w:r>
@@ -14000,7 +14495,7 @@
         <w:pStyle w:val="Compact"/>
         <w:numPr>
           <w:ilvl w:val="0"/>
-          <w:numId w:val="1028"/>
+          <w:numId w:val="1029"/>
         </w:numPr>
       </w:pPr>
       <w:r>
@@ -14023,7 +14518,7 @@
         <w:pStyle w:val="Compact"/>
         <w:numPr>
           <w:ilvl w:val="0"/>
-          <w:numId w:val="1028"/>
+          <w:numId w:val="1029"/>
         </w:numPr>
       </w:pPr>
       <w:r>
@@ -14046,7 +14541,7 @@
         <w:pStyle w:val="Compact"/>
         <w:numPr>
           <w:ilvl w:val="0"/>
-          <w:numId w:val="1028"/>
+          <w:numId w:val="1029"/>
         </w:numPr>
       </w:pPr>
       <w:r>
@@ -14069,7 +14564,7 @@
         <w:pStyle w:val="Compact"/>
         <w:numPr>
           <w:ilvl w:val="0"/>
-          <w:numId w:val="1028"/>
+          <w:numId w:val="1029"/>
         </w:numPr>
       </w:pPr>
       <w:r>
@@ -14092,7 +14587,7 @@
         <w:pStyle w:val="Compact"/>
         <w:numPr>
           <w:ilvl w:val="0"/>
-          <w:numId w:val="1028"/>
+          <w:numId w:val="1029"/>
         </w:numPr>
       </w:pPr>
       <w:r>
@@ -14283,7 +14778,7 @@
         <w:pStyle w:val="Compact"/>
         <w:numPr>
           <w:ilvl w:val="0"/>
-          <w:numId w:val="1028"/>
+          <w:numId w:val="1029"/>
         </w:numPr>
       </w:pPr>
       <w:r>
@@ -14339,7 +14834,7 @@
         <w:pStyle w:val="Compact"/>
         <w:numPr>
           <w:ilvl w:val="0"/>
-          <w:numId w:val="1028"/>
+          <w:numId w:val="1029"/>
         </w:numPr>
       </w:pPr>
       <w:r>
@@ -14362,7 +14857,7 @@
         <w:pStyle w:val="Compact"/>
         <w:numPr>
           <w:ilvl w:val="0"/>
-          <w:numId w:val="1028"/>
+          <w:numId w:val="1029"/>
         </w:numPr>
       </w:pPr>
       <w:r>
@@ -14385,7 +14880,7 @@
         <w:pStyle w:val="Compact"/>
         <w:numPr>
           <w:ilvl w:val="0"/>
-          <w:numId w:val="1028"/>
+          <w:numId w:val="1029"/>
         </w:numPr>
       </w:pPr>
       <w:r>
@@ -14408,7 +14903,7 @@
         <w:pStyle w:val="Compact"/>
         <w:numPr>
           <w:ilvl w:val="0"/>
-          <w:numId w:val="1028"/>
+          <w:numId w:val="1029"/>
         </w:numPr>
       </w:pPr>
       <w:r>
@@ -14431,7 +14926,7 @@
         <w:pStyle w:val="Compact"/>
         <w:numPr>
           <w:ilvl w:val="0"/>
-          <w:numId w:val="1028"/>
+          <w:numId w:val="1029"/>
         </w:numPr>
       </w:pPr>
       <w:r>
@@ -14454,7 +14949,7 @@
         <w:pStyle w:val="Compact"/>
         <w:numPr>
           <w:ilvl w:val="0"/>
-          <w:numId w:val="1028"/>
+          <w:numId w:val="1029"/>
         </w:numPr>
       </w:pPr>
       <w:r>
@@ -14477,7 +14972,7 @@
         <w:pStyle w:val="Compact"/>
         <w:numPr>
           <w:ilvl w:val="0"/>
-          <w:numId w:val="1028"/>
+          <w:numId w:val="1029"/>
         </w:numPr>
       </w:pPr>
       <w:r>
@@ -14510,7 +15005,7 @@
         <w:pStyle w:val="Compact"/>
         <w:numPr>
           <w:ilvl w:val="0"/>
-          <w:numId w:val="1029"/>
+          <w:numId w:val="1030"/>
         </w:numPr>
       </w:pPr>
       <w:r>
@@ -14533,7 +15028,7 @@
         <w:pStyle w:val="Compact"/>
         <w:numPr>
           <w:ilvl w:val="0"/>
-          <w:numId w:val="1029"/>
+          <w:numId w:val="1030"/>
         </w:numPr>
       </w:pPr>
       <w:r>
@@ -14578,7 +15073,7 @@
         <w:pStyle w:val="Compact"/>
         <w:numPr>
           <w:ilvl w:val="0"/>
-          <w:numId w:val="1030"/>
+          <w:numId w:val="1031"/>
         </w:numPr>
       </w:pPr>
       <w:r>
@@ -14601,7 +15096,7 @@
         <w:pStyle w:val="Compact"/>
         <w:numPr>
           <w:ilvl w:val="0"/>
-          <w:numId w:val="1030"/>
+          <w:numId w:val="1031"/>
         </w:numPr>
       </w:pPr>
       <w:r>
@@ -14624,7 +15119,7 @@
         <w:pStyle w:val="Compact"/>
         <w:numPr>
           <w:ilvl w:val="0"/>
-          <w:numId w:val="1030"/>
+          <w:numId w:val="1031"/>
         </w:numPr>
       </w:pPr>
       <w:r>
@@ -14647,7 +15142,7 @@
         <w:pStyle w:val="Compact"/>
         <w:numPr>
           <w:ilvl w:val="0"/>
-          <w:numId w:val="1030"/>
+          <w:numId w:val="1031"/>
         </w:numPr>
       </w:pPr>
       <w:r>
@@ -14670,7 +15165,7 @@
         <w:pStyle w:val="Compact"/>
         <w:numPr>
           <w:ilvl w:val="0"/>
-          <w:numId w:val="1030"/>
+          <w:numId w:val="1031"/>
         </w:numPr>
       </w:pPr>
       <w:r>
@@ -14693,7 +15188,7 @@
         <w:pStyle w:val="Compact"/>
         <w:numPr>
           <w:ilvl w:val="0"/>
-          <w:numId w:val="1030"/>
+          <w:numId w:val="1031"/>
         </w:numPr>
       </w:pPr>
       <w:r>
@@ -14716,7 +15211,7 @@
         <w:pStyle w:val="Compact"/>
         <w:numPr>
           <w:ilvl w:val="0"/>
-          <w:numId w:val="1030"/>
+          <w:numId w:val="1031"/>
         </w:numPr>
       </w:pPr>
       <w:r>
@@ -14739,7 +15234,7 @@
         <w:pStyle w:val="Compact"/>
         <w:numPr>
           <w:ilvl w:val="0"/>
-          <w:numId w:val="1030"/>
+          <w:numId w:val="1031"/>
         </w:numPr>
       </w:pPr>
       <w:r>
@@ -14762,7 +15257,7 @@
         <w:pStyle w:val="Compact"/>
         <w:numPr>
           <w:ilvl w:val="0"/>
-          <w:numId w:val="1030"/>
+          <w:numId w:val="1031"/>
         </w:numPr>
       </w:pPr>
       <w:r>
@@ -14785,7 +15280,7 @@
         <w:pStyle w:val="Compact"/>
         <w:numPr>
           <w:ilvl w:val="0"/>
-          <w:numId w:val="1030"/>
+          <w:numId w:val="1031"/>
         </w:numPr>
       </w:pPr>
       <w:r>
@@ -14808,7 +15303,7 @@
         <w:pStyle w:val="Compact"/>
         <w:numPr>
           <w:ilvl w:val="0"/>
-          <w:numId w:val="1030"/>
+          <w:numId w:val="1031"/>
         </w:numPr>
       </w:pPr>
       <w:r>
@@ -14831,7 +15326,7 @@
         <w:pStyle w:val="Compact"/>
         <w:numPr>
           <w:ilvl w:val="0"/>
-          <w:numId w:val="1030"/>
+          <w:numId w:val="1031"/>
         </w:numPr>
       </w:pPr>
       <w:r>
@@ -14854,7 +15349,7 @@
         <w:pStyle w:val="Compact"/>
         <w:numPr>
           <w:ilvl w:val="0"/>
-          <w:numId w:val="1030"/>
+          <w:numId w:val="1031"/>
         </w:numPr>
       </w:pPr>
       <w:r>
@@ -14877,7 +15372,7 @@
         <w:pStyle w:val="Compact"/>
         <w:numPr>
           <w:ilvl w:val="0"/>
-          <w:numId w:val="1030"/>
+          <w:numId w:val="1031"/>
         </w:numPr>
       </w:pPr>
       <w:r>
@@ -14900,7 +15395,7 @@
         <w:pStyle w:val="Compact"/>
         <w:numPr>
           <w:ilvl w:val="0"/>
-          <w:numId w:val="1030"/>
+          <w:numId w:val="1031"/>
         </w:numPr>
       </w:pPr>
       <w:r>
@@ -16595,7 +17090,7 @@
         <w:pStyle w:val="Compact"/>
         <w:numPr>
           <w:ilvl w:val="0"/>
-          <w:numId w:val="1031"/>
+          <w:numId w:val="1032"/>
         </w:numPr>
       </w:pPr>
       <w:hyperlink r:id="rId16">
@@ -16618,7 +17113,7 @@
         <w:pStyle w:val="Compact"/>
         <w:numPr>
           <w:ilvl w:val="0"/>
-          <w:numId w:val="1031"/>
+          <w:numId w:val="1032"/>
         </w:numPr>
       </w:pPr>
       <w:hyperlink r:id="rId14">
@@ -16641,7 +17136,7 @@
         <w:pStyle w:val="Compact"/>
         <w:numPr>
           <w:ilvl w:val="0"/>
-          <w:numId w:val="1031"/>
+          <w:numId w:val="1032"/>
         </w:numPr>
       </w:pPr>
       <w:hyperlink r:id="rId15">
@@ -16664,7 +17159,7 @@
         <w:pStyle w:val="Compact"/>
         <w:numPr>
           <w:ilvl w:val="0"/>
-          <w:numId w:val="1031"/>
+          <w:numId w:val="1032"/>
         </w:numPr>
       </w:pPr>
       <w:hyperlink r:id="rId17">
@@ -16693,7 +17188,7 @@
         <w:pStyle w:val="Compact"/>
         <w:numPr>
           <w:ilvl w:val="0"/>
-          <w:numId w:val="1031"/>
+          <w:numId w:val="1032"/>
         </w:numPr>
       </w:pPr>
       <w:hyperlink r:id="rId49">
@@ -16716,7 +17211,7 @@
         <w:pStyle w:val="Compact"/>
         <w:numPr>
           <w:ilvl w:val="0"/>
-          <w:numId w:val="1031"/>
+          <w:numId w:val="1032"/>
         </w:numPr>
       </w:pPr>
       <w:hyperlink r:id="rId74">
@@ -16736,7 +17231,7 @@
         <w:pStyle w:val="Compact"/>
         <w:numPr>
           <w:ilvl w:val="0"/>
-          <w:numId w:val="1031"/>
+          <w:numId w:val="1032"/>
         </w:numPr>
       </w:pPr>
       <w:hyperlink r:id="rId75">
@@ -17856,7 +18351,7 @@
         <w:pStyle w:val="Compact"/>
         <w:numPr>
           <w:ilvl w:val="0"/>
-          <w:numId w:val="1032"/>
+          <w:numId w:val="1033"/>
         </w:numPr>
       </w:pPr>
       <w:r>
@@ -17934,7 +18429,7 @@
         <w:pStyle w:val="Compact"/>
         <w:numPr>
           <w:ilvl w:val="0"/>
-          <w:numId w:val="1032"/>
+          <w:numId w:val="1033"/>
         </w:numPr>
       </w:pPr>
       <w:r>
@@ -17961,7 +18456,7 @@
         <w:pStyle w:val="Compact"/>
         <w:numPr>
           <w:ilvl w:val="0"/>
-          <w:numId w:val="1032"/>
+          <w:numId w:val="1033"/>
         </w:numPr>
       </w:pPr>
       <w:r>
@@ -18248,7 +18743,7 @@
         <w:pStyle w:val="Compact"/>
         <w:numPr>
           <w:ilvl w:val="0"/>
-          <w:numId w:val="1033"/>
+          <w:numId w:val="1034"/>
         </w:numPr>
       </w:pPr>
       <w:r>
@@ -18287,7 +18782,7 @@
         <w:pStyle w:val="Compact"/>
         <w:numPr>
           <w:ilvl w:val="0"/>
-          <w:numId w:val="1033"/>
+          <w:numId w:val="1034"/>
         </w:numPr>
       </w:pPr>
       <w:r>
@@ -18359,7 +18854,7 @@
         <w:pStyle w:val="Compact"/>
         <w:numPr>
           <w:ilvl w:val="0"/>
-          <w:numId w:val="1033"/>
+          <w:numId w:val="1034"/>
         </w:numPr>
       </w:pPr>
       <w:r>
@@ -18416,7 +18911,7 @@
         <w:pStyle w:val="Compact"/>
         <w:numPr>
           <w:ilvl w:val="0"/>
-          <w:numId w:val="1033"/>
+          <w:numId w:val="1034"/>
         </w:numPr>
       </w:pPr>
       <w:r>
@@ -19932,7 +20427,7 @@
         <w:pStyle w:val="Compact"/>
         <w:numPr>
           <w:ilvl w:val="0"/>
-          <w:numId w:val="1034"/>
+          <w:numId w:val="1035"/>
         </w:numPr>
       </w:pPr>
       <w:r>
@@ -19972,7 +20467,7 @@
         <w:pStyle w:val="Compact"/>
         <w:numPr>
           <w:ilvl w:val="0"/>
-          <w:numId w:val="1034"/>
+          <w:numId w:val="1035"/>
         </w:numPr>
       </w:pPr>
       <w:r>
@@ -20014,7 +20509,7 @@
         <w:pStyle w:val="Compact"/>
         <w:numPr>
           <w:ilvl w:val="0"/>
-          <w:numId w:val="1035"/>
+          <w:numId w:val="1036"/>
         </w:numPr>
       </w:pPr>
       <w:r>
@@ -20069,7 +20564,7 @@
         <w:pStyle w:val="Compact"/>
         <w:numPr>
           <w:ilvl w:val="0"/>
-          <w:numId w:val="1035"/>
+          <w:numId w:val="1036"/>
         </w:numPr>
       </w:pPr>
       <w:r>
@@ -20179,7 +20674,7 @@
         <w:pStyle w:val="Compact"/>
         <w:numPr>
           <w:ilvl w:val="0"/>
-          <w:numId w:val="1036"/>
+          <w:numId w:val="1037"/>
         </w:numPr>
       </w:pPr>
       <w:hyperlink r:id="rId95">
@@ -20196,7 +20691,7 @@
         <w:pStyle w:val="Compact"/>
         <w:numPr>
           <w:ilvl w:val="0"/>
-          <w:numId w:val="1036"/>
+          <w:numId w:val="1037"/>
         </w:numPr>
       </w:pPr>
       <w:hyperlink r:id="rId96">
@@ -20213,7 +20708,7 @@
         <w:pStyle w:val="Compact"/>
         <w:numPr>
           <w:ilvl w:val="0"/>
-          <w:numId w:val="1036"/>
+          <w:numId w:val="1037"/>
         </w:numPr>
       </w:pPr>
       <w:hyperlink r:id="rId97">
@@ -20230,7 +20725,7 @@
         <w:pStyle w:val="Compact"/>
         <w:numPr>
           <w:ilvl w:val="0"/>
-          <w:numId w:val="1036"/>
+          <w:numId w:val="1037"/>
         </w:numPr>
       </w:pPr>
       <w:hyperlink r:id="rId98">
@@ -20247,7 +20742,7 @@
         <w:pStyle w:val="Compact"/>
         <w:numPr>
           <w:ilvl w:val="0"/>
-          <w:numId w:val="1036"/>
+          <w:numId w:val="1037"/>
         </w:numPr>
       </w:pPr>
       <w:hyperlink r:id="rId99">
@@ -20264,7 +20759,7 @@
         <w:pStyle w:val="Compact"/>
         <w:numPr>
           <w:ilvl w:val="0"/>
-          <w:numId w:val="1036"/>
+          <w:numId w:val="1037"/>
         </w:numPr>
       </w:pPr>
       <w:hyperlink r:id="rId100">
@@ -20281,7 +20776,7 @@
         <w:pStyle w:val="Compact"/>
         <w:numPr>
           <w:ilvl w:val="0"/>
-          <w:numId w:val="1036"/>
+          <w:numId w:val="1037"/>
         </w:numPr>
       </w:pPr>
       <w:hyperlink r:id="rId101">
@@ -20298,7 +20793,7 @@
         <w:pStyle w:val="Compact"/>
         <w:numPr>
           <w:ilvl w:val="0"/>
-          <w:numId w:val="1036"/>
+          <w:numId w:val="1037"/>
         </w:numPr>
       </w:pPr>
       <w:hyperlink r:id="rId102">
@@ -20315,7 +20810,7 @@
         <w:pStyle w:val="Compact"/>
         <w:numPr>
           <w:ilvl w:val="0"/>
-          <w:numId w:val="1036"/>
+          <w:numId w:val="1037"/>
         </w:numPr>
       </w:pPr>
       <w:hyperlink r:id="rId103">
@@ -20365,7 +20860,7 @@
         <w:pStyle w:val="Compact"/>
         <w:numPr>
           <w:ilvl w:val="0"/>
-          <w:numId w:val="1037"/>
+          <w:numId w:val="1038"/>
         </w:numPr>
       </w:pPr>
       <w:r>
@@ -20387,7 +20882,7 @@
         <w:pStyle w:val="Compact"/>
         <w:numPr>
           <w:ilvl w:val="0"/>
-          <w:numId w:val="1037"/>
+          <w:numId w:val="1038"/>
         </w:numPr>
       </w:pPr>
       <w:r>
@@ -20409,7 +20904,7 @@
         <w:pStyle w:val="Compact"/>
         <w:numPr>
           <w:ilvl w:val="0"/>
-          <w:numId w:val="1037"/>
+          <w:numId w:val="1038"/>
         </w:numPr>
       </w:pPr>
       <w:r>
@@ -20469,7 +20964,7 @@
         <w:pStyle w:val="Compact"/>
         <w:numPr>
           <w:ilvl w:val="0"/>
-          <w:numId w:val="1037"/>
+          <w:numId w:val="1038"/>
         </w:numPr>
       </w:pPr>
       <w:r>
@@ -20517,7 +21012,7 @@
         <w:pStyle w:val="Compact"/>
         <w:numPr>
           <w:ilvl w:val="0"/>
-          <w:numId w:val="1037"/>
+          <w:numId w:val="1038"/>
         </w:numPr>
       </w:pPr>
       <w:r>
@@ -20869,6 +21364,9 @@
     <w:abstractNumId w:val="991"/>
   </w:num>
   <w:num w:numId="1004">
+    <w:abstractNumId w:val="991"/>
+  </w:num>
+  <w:num w:numId="1005">
     <w:abstractNumId w:val="99411"/>
     <w:lvlOverride w:ilvl="0">
       <w:startOverride w:val="1"/>
@@ -20898,9 +21396,6 @@
       <w:startOverride w:val="1"/>
     </w:lvlOverride>
   </w:num>
-  <w:num w:numId="1005">
-    <w:abstractNumId w:val="991"/>
-  </w:num>
   <w:num w:numId="1006">
     <w:abstractNumId w:val="991"/>
   </w:num>
@@ -20917,6 +21412,9 @@
     <w:abstractNumId w:val="991"/>
   </w:num>
   <w:num w:numId="1011">
+    <w:abstractNumId w:val="991"/>
+  </w:num>
+  <w:num w:numId="1012">
     <w:abstractNumId w:val="99411"/>
     <w:lvlOverride w:ilvl="0">
       <w:startOverride w:val="1"/>
@@ -20946,9 +21444,6 @@
       <w:startOverride w:val="1"/>
     </w:lvlOverride>
   </w:num>
-  <w:num w:numId="1012">
-    <w:abstractNumId w:val="991"/>
-  </w:num>
   <w:num w:numId="1013">
     <w:abstractNumId w:val="991"/>
   </w:num>
@@ -20956,34 +21451,7 @@
     <w:abstractNumId w:val="991"/>
   </w:num>
   <w:num w:numId="1015">
-    <w:abstractNumId w:val="99411"/>
-    <w:lvlOverride w:ilvl="0">
-      <w:startOverride w:val="1"/>
-    </w:lvlOverride>
-    <w:lvlOverride w:ilvl="1">
-      <w:startOverride w:val="1"/>
-    </w:lvlOverride>
-    <w:lvlOverride w:ilvl="2">
-      <w:startOverride w:val="1"/>
-    </w:lvlOverride>
-    <w:lvlOverride w:ilvl="3">
-      <w:startOverride w:val="1"/>
-    </w:lvlOverride>
-    <w:lvlOverride w:ilvl="4">
-      <w:startOverride w:val="1"/>
-    </w:lvlOverride>
-    <w:lvlOverride w:ilvl="5">
-      <w:startOverride w:val="1"/>
-    </w:lvlOverride>
-    <w:lvlOverride w:ilvl="6">
-      <w:startOverride w:val="1"/>
-    </w:lvlOverride>
-    <w:lvlOverride w:ilvl="7">
-      <w:startOverride w:val="1"/>
-    </w:lvlOverride>
-    <w:lvlOverride w:ilvl="8">
-      <w:startOverride w:val="1"/>
-    </w:lvlOverride>
+    <w:abstractNumId w:val="991"/>
   </w:num>
   <w:num w:numId="1016">
     <w:abstractNumId w:val="99411"/>
@@ -21016,7 +21484,34 @@
     </w:lvlOverride>
   </w:num>
   <w:num w:numId="1017">
-    <w:abstractNumId w:val="991"/>
+    <w:abstractNumId w:val="99411"/>
+    <w:lvlOverride w:ilvl="0">
+      <w:startOverride w:val="1"/>
+    </w:lvlOverride>
+    <w:lvlOverride w:ilvl="1">
+      <w:startOverride w:val="1"/>
+    </w:lvlOverride>
+    <w:lvlOverride w:ilvl="2">
+      <w:startOverride w:val="1"/>
+    </w:lvlOverride>
+    <w:lvlOverride w:ilvl="3">
+      <w:startOverride w:val="1"/>
+    </w:lvlOverride>
+    <w:lvlOverride w:ilvl="4">
+      <w:startOverride w:val="1"/>
+    </w:lvlOverride>
+    <w:lvlOverride w:ilvl="5">
+      <w:startOverride w:val="1"/>
+    </w:lvlOverride>
+    <w:lvlOverride w:ilvl="6">
+      <w:startOverride w:val="1"/>
+    </w:lvlOverride>
+    <w:lvlOverride w:ilvl="7">
+      <w:startOverride w:val="1"/>
+    </w:lvlOverride>
+    <w:lvlOverride w:ilvl="8">
+      <w:startOverride w:val="1"/>
+    </w:lvlOverride>
   </w:num>
   <w:num w:numId="1018">
     <w:abstractNumId w:val="991"/>
@@ -21076,6 +21571,9 @@
     <w:abstractNumId w:val="991"/>
   </w:num>
   <w:num w:numId="1037">
+    <w:abstractNumId w:val="991"/>
+  </w:num>
+  <w:num w:numId="1038">
     <w:abstractNumId w:val="991"/>
   </w:num>
 </w:numbering>

</xml_diff>

<commit_message>
docs: manual and egress runbook match the code (settings spelling, CLI, model delivery, console URL); re-render manual (D-001, D-004, D-005, D-009)
Remove CIVICCAST_EVENTS, /api/tokens and 'egress recovery-proof' (none exist in
code); document 'civiccast token' subcommands and 'egress verify-captions'; name
the caption-proof settings under the one-C spelling the code actually reads;
fix three runbook names to the two-C spelling the code reads.

Co-Authored-By: Claude Sonnet 5.5 <noreply@anthropic.com>
</commit_message>
<xml_diff>
--- a/docs/USER-MANUAL.docx
+++ b/docs/USER-MANUAL.docx
@@ -424,7 +424,13 @@
         <w:t xml:space="preserve"> </w:t>
       </w:r>
       <w:r>
-        <w:t xml:space="preserve">first-time installations also require the approximately 21 GB</w:t>
+        <w:t xml:space="preserve">first-time installations bring the large AI components in the approximately</w:t>
+      </w:r>
+      <w:r>
+        <w:t xml:space="preserve"> </w:t>
+      </w:r>
+      <w:r>
+        <w:t xml:space="preserve">21 GB</w:t>
       </w:r>
       <w:r>
         <w:t xml:space="preserve"> </w:t>
@@ -439,13 +445,19 @@
         <w:t xml:space="preserve"> </w:t>
       </w:r>
       <w:r>
-        <w:t xml:space="preserve">model</w:t>
-      </w:r>
-      <w:r>
-        <w:t xml:space="preserve"> </w:t>
-      </w:r>
-      <w:r>
-        <w:t xml:space="preserve">bundle delivered by USB or LAN. See the Windows installation section below.</w:t>
+        <w:t xml:space="preserve">model bundle delivered by USB or LAN (the offline</w:t>
+      </w:r>
+      <w:r>
+        <w:t xml:space="preserve"> </w:t>
+      </w:r>
+      <w:r>
+        <w:t xml:space="preserve">alternative) or through the installer’s own download screen. See the</w:t>
+      </w:r>
+      <w:r>
+        <w:t xml:space="preserve"> </w:t>
+      </w:r>
+      <w:r>
+        <w:t xml:space="preserve">Windows installation section below.</w:t>
       </w:r>
       <w:r>
         <w:t xml:space="preserve"> </w:t>
@@ -8136,7 +8148,47 @@
         <w:t xml:space="preserve"> </w:t>
       </w:r>
       <w:r>
-        <w:t xml:space="preserve">A first install needs the signed</w:t>
+        <w:t xml:space="preserve">The installer itself is small; the large AI</w:t>
+      </w:r>
+      <w:r>
+        <w:t xml:space="preserve"> </w:t>
+      </w:r>
+      <w:r>
+        <w:t xml:space="preserve">components (the caption engine, the local summary and translation model,</w:t>
+      </w:r>
+      <w:r>
+        <w:t xml:space="preserve"> </w:t>
+      </w:r>
+      <w:r>
+        <w:t xml:space="preserve">and on capable hardware an optional higher-quality caption engine and GPU</w:t>
+      </w:r>
+      <w:r>
+        <w:t xml:space="preserve"> </w:t>
+      </w:r>
+      <w:r>
+        <w:t xml:space="preserve">acceleration) are not inside it. During install the CivicCast Installer</w:t>
+      </w:r>
+      <w:r>
+        <w:t xml:space="preserve"> </w:t>
+      </w:r>
+      <w:r>
+        <w:t xml:space="preserve">window explains each large component, uses a copy already on the computer</w:t>
+      </w:r>
+      <w:r>
+        <w:t xml:space="preserve"> </w:t>
+      </w:r>
+      <w:r>
+        <w:t xml:space="preserve">(</w:t>
+      </w:r>
+      <w:r>
+        <w:rPr>
+          <w:b/>
+          <w:bCs/>
+        </w:rPr>
+        <w:t xml:space="preserve">Found locally - verified</w:t>
+      </w:r>
+      <w:r>
+        <w:t xml:space="preserve">, for example from a USB/LAN kit’s</w:t>
       </w:r>
       <w:r>
         <w:t xml:space="preserve"> </w:t>
@@ -8151,6 +8203,43 @@
         <w:t xml:space="preserve"> </w:t>
       </w:r>
       <w:r>
+        <w:t xml:space="preserve">folder or an earlier install) and downloads the rest with a progress</w:t>
+      </w:r>
+      <w:r>
+        <w:t xml:space="preserve"> </w:t>
+      </w:r>
+      <w:r>
+        <w:t xml:space="preserve">display and a</w:t>
+      </w:r>
+      <w:r>
+        <w:t xml:space="preserve"> </w:t>
+      </w:r>
+      <w:r>
+        <w:rPr>
+          <w:b/>
+          <w:bCs/>
+        </w:rPr>
+        <w:t xml:space="preserve">Stop downloading</w:t>
+      </w:r>
+      <w:r>
+        <w:t xml:space="preserve"> </w:t>
+      </w:r>
+      <w:r>
+        <w:t xml:space="preserve">button. The signed</w:t>
+      </w:r>
+      <w:r>
+        <w:t xml:space="preserve"> </w:t>
+      </w:r>
+      <w:r>
+        <w:rPr>
+          <w:rStyle w:val="VerbatimChar"/>
+        </w:rPr>
+        <w:t xml:space="preserve">station</w:t>
+      </w:r>
+      <w:r>
+        <w:t xml:space="preserve"> </w:t>
+      </w:r>
+      <w:r>
         <w:t xml:space="preserve">model</w:t>
       </w:r>
       <w:r>
@@ -8178,25 +8267,43 @@
         <w:t xml:space="preserve"> </w:t>
       </w:r>
       <w:r>
-        <w:t xml:space="preserve">runtime packs. Setup verifies and activates those model components,</w:t>
-      </w:r>
-      <w:r>
-        <w:t xml:space="preserve"> </w:t>
-      </w:r>
-      <w:r>
-        <w:t xml:space="preserve">including the required caption floor and summary/translation models.</w:t>
-      </w:r>
-      <w:r>
-        <w:t xml:space="preserve"> </w:t>
-      </w:r>
-      <w:r>
-        <w:t xml:space="preserve">Do not rely on background internet downloads to complete a missing</w:t>
-      </w:r>
-      <w:r>
-        <w:t xml:space="preserve"> </w:t>
-      </w:r>
-      <w:r>
-        <w:t xml:space="preserve">model bundle. Upgrades from beta.3 or later reuse matching cached models.</w:t>
+        <w:t xml:space="preserve">runtime packs, is the offline alternative. A first install with no kit and</w:t>
+      </w:r>
+      <w:r>
+        <w:t xml:space="preserve"> </w:t>
+      </w:r>
+      <w:r>
+        <w:t xml:space="preserve">no earlier install is not yet proven for beta.10: the setup step that</w:t>
+      </w:r>
+      <w:r>
+        <w:t xml:space="preserve"> </w:t>
+      </w:r>
+      <w:r>
+        <w:t xml:space="preserve">activates the station fails closed when it cannot find the model packs, so</w:t>
+      </w:r>
+      <w:r>
+        <w:t xml:space="preserve"> </w:t>
+      </w:r>
+      <w:r>
+        <w:t xml:space="preserve">use the kit your handoff names. Setup verifies and activates the model</w:t>
+      </w:r>
+      <w:r>
+        <w:t xml:space="preserve"> </w:t>
+      </w:r>
+      <w:r>
+        <w:t xml:space="preserve">components, including the required caption floor and summary/translation</w:t>
+      </w:r>
+      <w:r>
+        <w:t xml:space="preserve"> </w:t>
+      </w:r>
+      <w:r>
+        <w:t xml:space="preserve">models; there is no further background download after setup. Upgrades from</w:t>
+      </w:r>
+      <w:r>
+        <w:t xml:space="preserve"> </w:t>
+      </w:r>
+      <w:r>
+        <w:t xml:space="preserve">beta.3 or later reuse matching cached models.</w:t>
       </w:r>
     </w:p>
     <w:p>
@@ -8394,7 +8501,7 @@
         <w:pStyle w:val="FirstParagraph"/>
       </w:pPr>
       <w:r>
-        <w:t xml:space="preserve">After install, open the operator console at</w:t>
+        <w:t xml:space="preserve">After install, open the operator console on the station at</w:t>
       </w:r>
       <w:r>
         <w:t xml:space="preserve"> </w:t>
@@ -8409,7 +8516,29 @@
         <w:t xml:space="preserve"> </w:t>
       </w:r>
       <w:r>
-        <w:t xml:space="preserve">(or the installer-provided operator handoff URL), confirm</w:t>
+        <w:t xml:space="preserve">(or use the</w:t>
+      </w:r>
+      <w:r>
+        <w:t xml:space="preserve"> </w:t>
+      </w:r>
+      <w:r>
+        <w:rPr>
+          <w:b/>
+          <w:bCs/>
+        </w:rPr>
+        <w:t xml:space="preserve">CivicCast Operator Console</w:t>
+      </w:r>
+      <w:r>
+        <w:t xml:space="preserve"> </w:t>
+      </w:r>
+      <w:r>
+        <w:t xml:space="preserve">shortcut; first setup is only available from the station computer itself),</w:t>
+      </w:r>
+      <w:r>
+        <w:t xml:space="preserve"> </w:t>
+      </w:r>
+      <w:r>
+        <w:t xml:space="preserve">confirm</w:t>
       </w:r>
       <w:r>
         <w:t xml:space="preserve"> </w:t>
@@ -11508,13 +11637,52 @@
           <w:b/>
           <w:bCs/>
         </w:rPr>
+        <w:t xml:space="preserve">CIVICAST_CAPTION_PROOF_POLL_SECONDS</w:t>
+      </w:r>
+      <w:r>
+        <w:t xml:space="preserve"> </w:t>
+      </w:r>
+      <w:r>
+        <w:t xml:space="preserve">— Decode-back proof cadence in</w:t>
+      </w:r>
+      <w:r>
+        <w:t xml:space="preserve"> </w:t>
+      </w:r>
+      <w:r>
+        <w:t xml:space="preserve">seconds (default 30). The station reads this variable under its legacy</w:t>
+      </w:r>
+      <w:r>
+        <w:t xml:space="preserve"> </w:t>
+      </w:r>
+      <w:r>
+        <w:t xml:space="preserve">one-C spelling</w:t>
+      </w:r>
+      <w:r>
+        <w:t xml:space="preserve"> </w:t>
+      </w:r>
+      <w:r>
+        <w:rPr>
+          <w:rStyle w:val="VerbatimChar"/>
+        </w:rPr>
+        <w:t xml:space="preserve">CIVICAST_...</w:t>
+      </w:r>
+      <w:r>
+        <w:t xml:space="preserve">; setting the two-C spelling</w:t>
+      </w:r>
+      <w:r>
+        <w:t xml:space="preserve"> </w:t>
+      </w:r>
+      <w:r>
+        <w:rPr>
+          <w:rStyle w:val="VerbatimChar"/>
+        </w:rPr>
         <w:t xml:space="preserve">CIVICCAST_CAPTION_PROOF_POLL_SECONDS</w:t>
       </w:r>
       <w:r>
         <w:t xml:space="preserve"> </w:t>
       </w:r>
       <w:r>
-        <w:t xml:space="preserve">— Caption feed and decode-back proof cadence.</w:t>
+        <w:t xml:space="preserve">has no effect.</w:t>
       </w:r>
     </w:p>
     <w:p>
@@ -11531,6 +11699,35 @@
           <w:b/>
           <w:bCs/>
         </w:rPr>
+        <w:t xml:space="preserve">CIVICAST_CAPTION_PROOF_TIMEOUT_SECONDS</w:t>
+      </w:r>
+      <w:r>
+        <w:t xml:space="preserve"> </w:t>
+      </w:r>
+      <w:r>
+        <w:t xml:space="preserve">— Time limit in seconds for one</w:t>
+      </w:r>
+      <w:r>
+        <w:t xml:space="preserve"> </w:t>
+      </w:r>
+      <w:r>
+        <w:t xml:space="preserve">caption proof capture and decode-back (default 15). Same one-C spelling.</w:t>
+      </w:r>
+    </w:p>
+    <w:p>
+      <w:pPr>
+        <w:pStyle w:val="Compact"/>
+        <w:numPr>
+          <w:ilvl w:val="0"/>
+          <w:numId w:val="1021"/>
+        </w:numPr>
+      </w:pPr>
+      <w:r>
+        <w:rPr>
+          <w:rStyle w:val="VerbatimChar"/>
+          <w:b/>
+          <w:bCs/>
+        </w:rPr>
         <w:t xml:space="preserve">CIVICCAST_EAS</w:t>
       </w:r>
       <w:r>
@@ -11630,29 +11827,6 @@
       </w:r>
       <w:r>
         <w:t xml:space="preserve">— JSON file holding Twilio SMS credentials.</w:t>
-      </w:r>
-    </w:p>
-    <w:p>
-      <w:pPr>
-        <w:pStyle w:val="Compact"/>
-        <w:numPr>
-          <w:ilvl w:val="0"/>
-          <w:numId w:val="1021"/>
-        </w:numPr>
-      </w:pPr>
-      <w:r>
-        <w:rPr>
-          <w:rStyle w:val="VerbatimChar"/>
-          <w:b/>
-          <w:bCs/>
-        </w:rPr>
-        <w:t xml:space="preserve">CIVICCAST_EVENTS</w:t>
-      </w:r>
-      <w:r>
-        <w:t xml:space="preserve"> </w:t>
-      </w:r>
-      <w:r>
-        <w:t xml:space="preserve">— Event-bus on/off.</w:t>
       </w:r>
     </w:p>
     <w:bookmarkEnd w:id="59"/>
@@ -14754,24 +14928,6 @@
       <w:r>
         <w:t xml:space="preserve">“How to point this station at coturn.”</w:t>
       </w:r>
-      <w:r>
-        <w:t xml:space="preserve"> </w:t>
-      </w:r>
-      <w:r>
-        <w:t xml:space="preserve">On Linux/macOS these still</w:t>
-      </w:r>
-      <w:r>
-        <w:t xml:space="preserve"> </w:t>
-      </w:r>
-      <w:r>
-        <w:t xml:space="preserve">work the same way if you’d rather point at an external server than run</w:t>
-      </w:r>
-      <w:r>
-        <w:t xml:space="preserve"> </w:t>
-      </w:r>
-      <w:r>
-        <w:t xml:space="preserve">coturn locally.</w:t>
-      </w:r>
     </w:p>
     <w:p>
       <w:pPr>
@@ -14793,19 +14949,13 @@
         <w:br/>
       </w:r>
       <w:r>
-        <w:t xml:space="preserve">Linux/macOS only — the local coturn launch command, if you’re running</w:t>
-      </w:r>
-      <w:r>
-        <w:t xml:space="preserve"> </w:t>
-      </w:r>
-      <w:r>
-        <w:t xml:space="preserve">coturn on the station itself rather than pointing at an external server</w:t>
-      </w:r>
-      <w:r>
-        <w:t xml:space="preserve"> </w:t>
-      </w:r>
-      <w:r>
-        <w:t xml:space="preserve">(see</w:t>
+        <w:t xml:space="preserve">The local coturn launch command, for an integrator who runs coturn on the</w:t>
+      </w:r>
+      <w:r>
+        <w:t xml:space="preserve"> </w:t>
+      </w:r>
+      <w:r>
+        <w:t xml:space="preserve">same machine rather than pointing at an external server (see</w:t>
       </w:r>
       <w:r>
         <w:t xml:space="preserve"> </w:t>
@@ -14820,13 +14970,13 @@
         <w:t xml:space="preserve"> </w:t>
       </w:r>
       <w:r>
-        <w:t xml:space="preserve">above). Leave unset on Windows; there is no</w:t>
-      </w:r>
-      <w:r>
-        <w:t xml:space="preserve"> </w:t>
-      </w:r>
-      <w:r>
-        <w:t xml:space="preserve">native Windows build.</w:t>
+        <w:t xml:space="preserve">above). Leave unset on a Windows station; coturn has</w:t>
+      </w:r>
+      <w:r>
+        <w:t xml:space="preserve"> </w:t>
+      </w:r>
+      <w:r>
+        <w:t xml:space="preserve">no native Windows build.</w:t>
       </w:r>
     </w:p>
     <w:p>
@@ -15871,7 +16021,7 @@
         <w:rPr>
           <w:rStyle w:val="VerbatimChar"/>
         </w:rPr>
-        <w:t xml:space="preserve">    # Generic Linux/macOS bootstrap planning only. Windows deployment</w:t>
+        <w:t xml:space="preserve">    # Development planning output only; CivicCast installs on Windows 11 and</w:t>
       </w:r>
       <w:r>
         <w:br/>
@@ -15880,7 +16030,7 @@
         <w:rPr>
           <w:rStyle w:val="VerbatimChar"/>
         </w:rPr>
-        <w:t xml:space="preserve">    # readiness is decided separately by the native station's own</w:t>
+        <w:t xml:space="preserve">    # has no Linux or macOS install target. Windows deployment readiness is</w:t>
       </w:r>
       <w:r>
         <w:br/>
@@ -15889,7 +16039,7 @@
         <w:rPr>
           <w:rStyle w:val="VerbatimChar"/>
         </w:rPr>
-        <w:t xml:space="preserve">    # activation state (civiccast.installer.service), not this plan.</w:t>
+        <w:t xml:space="preserve">    # decided separately by the native station's own activation state</w:t>
       </w:r>
       <w:r>
         <w:br/>
@@ -15898,6 +16048,15 @@
         <w:rPr>
           <w:rStyle w:val="VerbatimChar"/>
         </w:rPr>
+        <w:t xml:space="preserve">    # (civiccast.installer.service), not this plan.</w:t>
+      </w:r>
+      <w:r>
+        <w:br/>
+      </w:r>
+      <w:r>
+        <w:rPr>
+          <w:rStyle w:val="VerbatimChar"/>
+        </w:rPr>
         <w:t xml:space="preserve">civiccast installer verify-package --artifact PATH --sidecar PATH</w:t>
       </w:r>
       <w:r>
@@ -16015,18 +16174,63 @@
         <w:rPr>
           <w:rStyle w:val="VerbatimChar"/>
         </w:rPr>
-        <w:t xml:space="preserve">civiccast token …               (managed by the operator console; see /api/tokens)</w:t>
+        <w:t xml:space="preserve">civiccast token generate-env</w:t>
       </w:r>
       <w:r>
         <w:br/>
       </w:r>
       <w:r>
+        <w:rPr>
+          <w:rStyle w:val="VerbatimChar"/>
+        </w:rPr>
+        <w:t xml:space="preserve">civiccast token issue --operator-id ID --display-name NAME \</w:t>
+      </w:r>
+      <w:r>
         <w:br/>
       </w:r>
       <w:r>
         <w:rPr>
           <w:rStyle w:val="VerbatimChar"/>
         </w:rPr>
+        <w:t xml:space="preserve">    [--scopes S] [--save-keyring]</w:t>
+      </w:r>
+      <w:r>
+        <w:br/>
+      </w:r>
+      <w:r>
+        <w:rPr>
+          <w:rStyle w:val="VerbatimChar"/>
+        </w:rPr>
+        <w:t xml:space="preserve">civiccast token list</w:t>
+      </w:r>
+      <w:r>
+        <w:br/>
+      </w:r>
+      <w:r>
+        <w:rPr>
+          <w:rStyle w:val="VerbatimChar"/>
+        </w:rPr>
+        <w:t xml:space="preserve">civiccast token revoke … [--reason TEXT]</w:t>
+      </w:r>
+      <w:r>
+        <w:br/>
+      </w:r>
+      <w:r>
+        <w:rPr>
+          <w:rStyle w:val="VerbatimChar"/>
+        </w:rPr>
+        <w:t xml:space="preserve">civiccast token rotate … [--save-keyring]</w:t>
+      </w:r>
+      <w:r>
+        <w:br/>
+      </w:r>
+      <w:r>
+        <w:br/>
+      </w:r>
+      <w:r>
+        <w:rPr>
+          <w:rStyle w:val="VerbatimChar"/>
+        </w:rPr>
         <w:t xml:space="preserve">civiccast cable package --asset-id ID --title T --media F \</w:t>
       </w:r>
       <w:r>
@@ -16114,7 +16318,7 @@
         <w:rPr>
           <w:rStyle w:val="VerbatimChar"/>
         </w:rPr>
-        <w:t xml:space="preserve">civiccast egress recovery-proof --channel-id CH \</w:t>
+        <w:t xml:space="preserve">civiccast egress continuity-proof --source-plan-json J \</w:t>
       </w:r>
       <w:r>
         <w:br/>
@@ -16123,7 +16327,7 @@
         <w:rPr>
           <w:rStyle w:val="VerbatimChar"/>
         </w:rPr>
-        <w:t xml:space="preserve">    --measured-seconds N …</w:t>
+        <w:t xml:space="preserve">    --config-json J \</w:t>
       </w:r>
       <w:r>
         <w:br/>
@@ -16132,7 +16336,7 @@
         <w:rPr>
           <w:rStyle w:val="VerbatimChar"/>
         </w:rPr>
-        <w:t xml:space="preserve">civiccast egress continuity-proof --source-plan-json J \</w:t>
+        <w:t xml:space="preserve">    --output-path F</w:t>
       </w:r>
       <w:r>
         <w:br/>
@@ -16141,7 +16345,7 @@
         <w:rPr>
           <w:rStyle w:val="VerbatimChar"/>
         </w:rPr>
-        <w:t xml:space="preserve">    --config-json J \</w:t>
+        <w:t xml:space="preserve">civiccast egress srt-continuity-proof \</w:t>
       </w:r>
       <w:r>
         <w:br/>
@@ -16150,7 +16354,7 @@
         <w:rPr>
           <w:rStyle w:val="VerbatimChar"/>
         </w:rPr>
-        <w:t xml:space="preserve">    --output-path F</w:t>
+        <w:t xml:space="preserve">    --source-plan-json J --config-json J \</w:t>
       </w:r>
       <w:r>
         <w:br/>
@@ -16159,7 +16363,7 @@
         <w:rPr>
           <w:rStyle w:val="VerbatimChar"/>
         </w:rPr>
-        <w:t xml:space="preserve">civiccast egress srt-continuity-proof \</w:t>
+        <w:t xml:space="preserve">    --sender-url U --receiver-url U \</w:t>
       </w:r>
       <w:r>
         <w:br/>
@@ -16168,7 +16372,7 @@
         <w:rPr>
           <w:rStyle w:val="VerbatimChar"/>
         </w:rPr>
-        <w:t xml:space="preserve">    --source-plan-json J --config-json J \</w:t>
+        <w:t xml:space="preserve">    --receiver-output-path F</w:t>
       </w:r>
       <w:r>
         <w:br/>
@@ -16177,7 +16381,7 @@
         <w:rPr>
           <w:rStyle w:val="VerbatimChar"/>
         </w:rPr>
-        <w:t xml:space="preserve">    --sender-url U --receiver-url U \</w:t>
+        <w:t xml:space="preserve">civiccast egress caption-decode-proof --channel-id CH …</w:t>
       </w:r>
       <w:r>
         <w:br/>
@@ -16186,7 +16390,7 @@
         <w:rPr>
           <w:rStyle w:val="VerbatimChar"/>
         </w:rPr>
-        <w:t xml:space="preserve">    --receiver-output-path F</w:t>
+        <w:t xml:space="preserve">civiccast egress verify-captions [--duration-seconds 8] [--muxrate-kbps 2000] \</w:t>
       </w:r>
       <w:r>
         <w:br/>
@@ -16195,7 +16399,7 @@
         <w:rPr>
           <w:rStyle w:val="VerbatimChar"/>
         </w:rPr>
-        <w:t xml:space="preserve">civiccast egress caption-decode-proof --channel-id CH …</w:t>
+        <w:t xml:space="preserve">    [--work-dir D] [--caption-text T]</w:t>
       </w:r>
       <w:r>
         <w:br/>
@@ -17036,43 +17240,70 @@
         <w:t xml:space="preserve"> </w:t>
       </w:r>
       <w:r>
-        <w:t xml:space="preserve">CivicCast also provisions the local Ollama runtime for</w:t>
-      </w:r>
-      <w:r>
-        <w:t xml:space="preserve"> </w:t>
-      </w:r>
-      <w:r>
-        <w:t xml:space="preserve">on-station AI (reusing a healthy existing install if one is already present</w:t>
-      </w:r>
-      <w:r>
-        <w:t xml:space="preserve"> </w:t>
-      </w:r>
-      <w:r>
-        <w:t xml:space="preserve">and installing a pinned version only when Ollama is absent), then ensures the</w:t>
-      </w:r>
-      <w:r>
-        <w:t xml:space="preserve"> </w:t>
-      </w:r>
-      <w:r>
-        <w:t xml:space="preserve">same three-tag target set of standard summary and translation models,</w:t>
-      </w:r>
-      <w:r>
-        <w:t xml:space="preserve"> </w:t>
-      </w:r>
-      <w:r>
-        <w:t xml:space="preserve">downloading only the tags still missing, in the background after the</w:t>
-      </w:r>
-      <w:r>
-        <w:t xml:space="preserve"> </w:t>
-      </w:r>
-      <w:r>
-        <w:t xml:space="preserve">operator console is already reachable; a model-download failure is reported</w:t>
-      </w:r>
-      <w:r>
-        <w:t xml:space="preserve"> </w:t>
-      </w:r>
-      <w:r>
-        <w:t xml:space="preserve">honestly without blocking the rest of the install.</w:t>
+        <w:t xml:space="preserve">CivicCast runs its own bundled local Ollama runtime</w:t>
+      </w:r>
+      <w:r>
+        <w:t xml:space="preserve"> </w:t>
+      </w:r>
+      <w:r>
+        <w:t xml:space="preserve">for on-station AI. The standard summary and translation models arrive during</w:t>
+      </w:r>
+      <w:r>
+        <w:t xml:space="preserve"> </w:t>
+      </w:r>
+      <w:r>
+        <w:t xml:space="preserve">install, from the USB/LAN kit or through the installer’s download screen (see</w:t>
+      </w:r>
+      <w:r>
+        <w:t xml:space="preserve"> </w:t>
+      </w:r>
+      <w:r>
+        <w:t xml:space="preserve">“Local AI models”</w:t>
+      </w:r>
+      <w:r>
+        <w:t xml:space="preserve"> </w:t>
+      </w:r>
+      <w:r>
+        <w:t xml:space="preserve">in the Windows installation section above); setup does not</w:t>
+      </w:r>
+      <w:r>
+        <w:t xml:space="preserve"> </w:t>
+      </w:r>
+      <w:r>
+        <w:t xml:space="preserve">start a further background download afterwards. A technical admin can fetch</w:t>
+      </w:r>
+      <w:r>
+        <w:t xml:space="preserve"> </w:t>
+      </w:r>
+      <w:r>
+        <w:t xml:space="preserve">or import models later with</w:t>
+      </w:r>
+      <w:r>
+        <w:t xml:space="preserve"> </w:t>
+      </w:r>
+      <w:r>
+        <w:rPr>
+          <w:rStyle w:val="VerbatimChar"/>
+        </w:rPr>
+        <w:t xml:space="preserve">civiccast model download</w:t>
+      </w:r>
+      <w:r>
+        <w:t xml:space="preserve"> </w:t>
+      </w:r>
+      <w:r>
+        <w:t xml:space="preserve">or</w:t>
+      </w:r>
+      <w:r>
+        <w:t xml:space="preserve"> </w:t>
+      </w:r>
+      <w:r>
+        <w:rPr>
+          <w:rStyle w:val="VerbatimChar"/>
+        </w:rPr>
+        <w:t xml:space="preserve">civiccast model import-offline</w:t>
+      </w:r>
+      <w:r>
+        <w:t xml:space="preserve">.</w:t>
       </w:r>
     </w:p>
     <w:bookmarkEnd w:id="73"/>

</xml_diff>